<commit_message>
RD: resumen 2do parcial de Baró con formato del resumen práctico del 1er parcial (carátula mínima, índice paginado, Arial)
scripts/resumen-pdf.js: md -> pdf estilo resumen de cursada, índice con nº de página en dos pasadas.

Co-Authored-By: Claude Opus 5.5 (1M context) <noreply@anthropic.com>
</commit_message>
<xml_diff>
--- a/materias/RD/estudio/resumen-2do-parcial-baro.docx
+++ b/materias/RD/estudio/resumen-2do-parcial-baro.docx
@@ -20,7 +20,7 @@
           <w:szCs w:val="30"/>
           <w:lang w:val="es-AR"/>
         </w:rPr>
-        <w:t xml:space="preserve">REDES DE DATOS — RESUMEN 2DO PARCIAL PRÁCTICO (PROF. BARÓ)</w:t>
+        <w:t xml:space="preserve">REDES DE DATOS - PRÁCTICA</w:t>
       </w:r>
     </w:p>
     <w:p>
@@ -41,7 +41,7 @@
           <w:szCs w:val="25"/>
           <w:lang w:val="es-AR"/>
         </w:rPr>
-        <w:t xml:space="preserve">1. SERVICIOS DE LA CAPA DE RED (TANENBAUM 5.1)</w:t>
+        <w:t xml:space="preserve">SERVICIOS DE LA CAPA DE RED</w:t>
       </w:r>
     </w:p>
     <w:p>
@@ -972,7 +972,7 @@
           <w:szCs w:val="25"/>
           <w:lang w:val="es-AR"/>
         </w:rPr>
-        <w:t xml:space="preserve">2. RUTEO (TANENBAUM 5.2.1–5.2.5)</w:t>
+        <w:t xml:space="preserve">RUTEO</w:t>
       </w:r>
     </w:p>
     <w:p>
@@ -1015,7 +1015,29 @@
           <w:szCs w:val="22"/>
           <w:lang w:val="es-AR"/>
         </w:rPr>
-        <w:t xml:space="preserve">Ruteo [Tanenbaum]:</w:t>
+        <w:t xml:space="preserve">Ruteo:</w:t>
+      </w:r>
+      <w:r>
+        <w:rPr>
+          <w:rFonts w:ascii="Lexend" w:cs="Lexend" w:eastAsia="Lexend" w:hAnsi="Lexend"/>
+          <w:color w:val="1A1A1A"/>
+          <w:sz w:val="22"/>
+          <w:szCs w:val="22"/>
+          <w:lang w:val="es-AR"/>
+        </w:rPr>
+        <w:t xml:space="preserve"> </w:t>
+      </w:r>
+      <w:r>
+        <w:rPr>
+          <w:rFonts w:ascii="Lexend" w:cs="Lexend" w:eastAsia="Lexend" w:hAnsi="Lexend"/>
+          <w:i/>
+          <w:iCs/>
+          <w:color w:val="1A1A1A"/>
+          <w:sz w:val="22"/>
+          <w:szCs w:val="22"/>
+          <w:lang w:val="es-AR"/>
+        </w:rPr>
+        <w:t xml:space="preserve">(Tanenbaum)</w:t>
       </w:r>
       <w:r>
         <w:rPr>
@@ -1180,7 +1202,29 @@
           <w:szCs w:val="22"/>
           <w:lang w:val="es-AR"/>
         </w:rPr>
-        <w:t xml:space="preserve">Tabla de ruteo [Tanenbaum]:</w:t>
+        <w:t xml:space="preserve">Tabla de ruteo:</w:t>
+      </w:r>
+      <w:r>
+        <w:rPr>
+          <w:rFonts w:ascii="Lexend" w:cs="Lexend" w:eastAsia="Lexend" w:hAnsi="Lexend"/>
+          <w:color w:val="1A1A1A"/>
+          <w:sz w:val="22"/>
+          <w:szCs w:val="22"/>
+          <w:lang w:val="es-AR"/>
+        </w:rPr>
+        <w:t xml:space="preserve"> </w:t>
+      </w:r>
+      <w:r>
+        <w:rPr>
+          <w:rFonts w:ascii="Lexend" w:cs="Lexend" w:eastAsia="Lexend" w:hAnsi="Lexend"/>
+          <w:i/>
+          <w:iCs/>
+          <w:color w:val="1A1A1A"/>
+          <w:sz w:val="22"/>
+          <w:szCs w:val="22"/>
+          <w:lang w:val="es-AR"/>
+        </w:rPr>
+        <w:t xml:space="preserve">(Tanenbaum)</w:t>
       </w:r>
       <w:r>
         <w:rPr>
@@ -1279,7 +1323,29 @@
           <w:szCs w:val="22"/>
           <w:lang w:val="es-AR"/>
         </w:rPr>
-        <w:t xml:space="preserve">Ruta default [Tanenbaum]:</w:t>
+        <w:t xml:space="preserve">Ruta default:</w:t>
+      </w:r>
+      <w:r>
+        <w:rPr>
+          <w:rFonts w:ascii="Lexend" w:cs="Lexend" w:eastAsia="Lexend" w:hAnsi="Lexend"/>
+          <w:color w:val="1A1A1A"/>
+          <w:sz w:val="22"/>
+          <w:szCs w:val="22"/>
+          <w:lang w:val="es-AR"/>
+        </w:rPr>
+        <w:t xml:space="preserve"> </w:t>
+      </w:r>
+      <w:r>
+        <w:rPr>
+          <w:rFonts w:ascii="Lexend" w:cs="Lexend" w:eastAsia="Lexend" w:hAnsi="Lexend"/>
+          <w:i/>
+          <w:iCs/>
+          <w:color w:val="1A1A1A"/>
+          <w:sz w:val="22"/>
+          <w:szCs w:val="22"/>
+          <w:lang w:val="es-AR"/>
+        </w:rPr>
+        <w:t xml:space="preserve">(Tanenbaum)</w:t>
       </w:r>
       <w:r>
         <w:rPr>
@@ -1574,7 +1640,7 @@
           <w:szCs w:val="22"/>
           <w:lang w:val="es-AR"/>
         </w:rPr>
-        <w:t xml:space="preserve">Principio de optimalidad (5.2.1):</w:t>
+        <w:t xml:space="preserve">Principio de optimalidad:</w:t>
       </w:r>
       <w:r>
         <w:rPr>
@@ -1649,7 +1715,7 @@
           <w:szCs w:val="22"/>
           <w:lang w:val="es-AR"/>
         </w:rPr>
-        <w:t xml:space="preserve">Camino más corto, Dijkstra (5.2.2):</w:t>
+        <w:t xml:space="preserve">Camino más corto, Dijkstra:</w:t>
       </w:r>
       <w:r>
         <w:rPr>
@@ -1714,7 +1780,7 @@
           <w:szCs w:val="22"/>
           <w:lang w:val="es-AR"/>
         </w:rPr>
-        <w:t xml:space="preserve">, 5.2.3):</w:t>
+        <w:t xml:space="preserve">):</w:t>
       </w:r>
       <w:r>
         <w:rPr>
@@ -1814,7 +1880,7 @@
           <w:szCs w:val="22"/>
           <w:lang w:val="es-AR"/>
         </w:rPr>
-        <w:t xml:space="preserve">Vector distancia (5.2.4), o Bellman-Ford:</w:t>
+        <w:t xml:space="preserve">Vector distancia, o Bellman-Ford:</w:t>
       </w:r>
       <w:r>
         <w:rPr>
@@ -1984,7 +2050,7 @@
           <w:szCs w:val="22"/>
           <w:lang w:val="es-AR"/>
         </w:rPr>
-        <w:t xml:space="preserve">Estado de enlace (5.2.5):</w:t>
+        <w:t xml:space="preserve">Estado de enlace:</w:t>
       </w:r>
       <w:r>
         <w:rPr>
@@ -2270,7 +2336,29 @@
           <w:szCs w:val="22"/>
           <w:lang w:val="es-AR"/>
         </w:rPr>
-        <w:t xml:space="preserve">Composición del LSP [Tanenbaum]:</w:t>
+        <w:t xml:space="preserve">Composición del LSP:</w:t>
+      </w:r>
+      <w:r>
+        <w:rPr>
+          <w:rFonts w:ascii="Lexend" w:cs="Lexend" w:eastAsia="Lexend" w:hAnsi="Lexend"/>
+          <w:color w:val="1A1A1A"/>
+          <w:sz w:val="22"/>
+          <w:szCs w:val="22"/>
+          <w:lang w:val="es-AR"/>
+        </w:rPr>
+        <w:t xml:space="preserve"> </w:t>
+      </w:r>
+      <w:r>
+        <w:rPr>
+          <w:rFonts w:ascii="Lexend" w:cs="Lexend" w:eastAsia="Lexend" w:hAnsi="Lexend"/>
+          <w:i/>
+          <w:iCs/>
+          <w:color w:val="1A1A1A"/>
+          <w:sz w:val="22"/>
+          <w:szCs w:val="22"/>
+          <w:lang w:val="es-AR"/>
+        </w:rPr>
+        <w:t xml:space="preserve">(Tanenbaum)</w:t>
       </w:r>
       <w:r>
         <w:rPr>
@@ -2391,7 +2479,29 @@
           <w:szCs w:val="22"/>
           <w:lang w:val="es-AR"/>
         </w:rPr>
-        <w:t xml:space="preserve">El grafo [Tanenbaum]:</w:t>
+        <w:t xml:space="preserve">El grafo:</w:t>
+      </w:r>
+      <w:r>
+        <w:rPr>
+          <w:rFonts w:ascii="Lexend" w:cs="Lexend" w:eastAsia="Lexend" w:hAnsi="Lexend"/>
+          <w:color w:val="1A1A1A"/>
+          <w:sz w:val="22"/>
+          <w:szCs w:val="22"/>
+          <w:lang w:val="es-AR"/>
+        </w:rPr>
+        <w:t xml:space="preserve"> </w:t>
+      </w:r>
+      <w:r>
+        <w:rPr>
+          <w:rFonts w:ascii="Lexend" w:cs="Lexend" w:eastAsia="Lexend" w:hAnsi="Lexend"/>
+          <w:i/>
+          <w:iCs/>
+          <w:color w:val="1A1A1A"/>
+          <w:sz w:val="22"/>
+          <w:szCs w:val="22"/>
+          <w:lang w:val="es-AR"/>
+        </w:rPr>
+        <w:t xml:space="preserve">(Tanenbaum)</w:t>
       </w:r>
       <w:r>
         <w:rPr>
@@ -2465,7 +2575,7 @@
           <w:szCs w:val="21"/>
           <w:lang w:val="es-AR"/>
         </w:rPr>
-        <w:t xml:space="preserve">VECTOR DISTANCIA VS ESTADO DE ENLACE (PREGUNTA DE LA GUÍA)</w:t>
+        <w:t xml:space="preserve">VECTOR DISTANCIA VS ESTADO DE ENLACE</w:t>
       </w:r>
     </w:p>
     <w:tbl>
@@ -3250,7 +3360,7 @@
           <w:szCs w:val="25"/>
           <w:lang w:val="es-AR"/>
         </w:rPr>
-        <w:t xml:space="preserve">3. PROTOCOLO IP (TANENBAUM 5.6.1)</w:t>
+        <w:t xml:space="preserve">PROTOCOLO IP</w:t>
       </w:r>
     </w:p>
     <w:p>
@@ -3270,7 +3380,67 @@
           <w:szCs w:val="21"/>
           <w:lang w:val="es-AR"/>
         </w:rPr>
-        <w:t xml:space="preserve">HEADER IPV4: 20 BYTES FIJOS + HASTA 40 DE OPCIONES (EN FILAS DE 32 BITS)</w:t>
+        <w:t xml:space="preserve">HEADER IPV4</w:t>
+      </w:r>
+    </w:p>
+    <w:p>
+      <w:pPr>
+        <w:spacing w:after="120" w:line="280"/>
+        <w:jc w:val="both"/>
+      </w:pPr>
+      <w:r>
+        <w:rPr>
+          <w:rFonts w:ascii="Lexend" w:cs="Lexend" w:eastAsia="Lexend" w:hAnsi="Lexend"/>
+          <w:color w:val="1A1A1A"/>
+          <w:sz w:val="22"/>
+          <w:szCs w:val="22"/>
+          <w:lang w:val="es-AR"/>
+        </w:rPr>
+        <w:t xml:space="preserve">Tiene </w:t>
+      </w:r>
+      <w:r>
+        <w:rPr>
+          <w:rFonts w:ascii="Lexend" w:cs="Lexend" w:eastAsia="Lexend" w:hAnsi="Lexend"/>
+          <w:b/>
+          <w:bCs/>
+          <w:color w:val="1A1A1A"/>
+          <w:sz w:val="22"/>
+          <w:szCs w:val="22"/>
+          <w:lang w:val="es-AR"/>
+        </w:rPr>
+        <w:t xml:space="preserve">20 bytes fijos</w:t>
+      </w:r>
+      <w:r>
+        <w:rPr>
+          <w:rFonts w:ascii="Lexend" w:cs="Lexend" w:eastAsia="Lexend" w:hAnsi="Lexend"/>
+          <w:color w:val="1A1A1A"/>
+          <w:sz w:val="22"/>
+          <w:szCs w:val="22"/>
+          <w:lang w:val="es-AR"/>
+        </w:rPr>
+        <w:t xml:space="preserve"> más hasta </w:t>
+      </w:r>
+      <w:r>
+        <w:rPr>
+          <w:rFonts w:ascii="Lexend" w:cs="Lexend" w:eastAsia="Lexend" w:hAnsi="Lexend"/>
+          <w:b/>
+          <w:bCs/>
+          <w:color w:val="1A1A1A"/>
+          <w:sz w:val="22"/>
+          <w:szCs w:val="22"/>
+          <w:lang w:val="es-AR"/>
+        </w:rPr>
+        <w:t xml:space="preserve">40 de opciones</w:t>
+      </w:r>
+      <w:r>
+        <w:rPr>
+          <w:rFonts w:ascii="Lexend" w:cs="Lexend" w:eastAsia="Lexend" w:hAnsi="Lexend"/>
+          <w:color w:val="1A1A1A"/>
+          <w:sz w:val="22"/>
+          <w:szCs w:val="22"/>
+          <w:lang w:val="es-AR"/>
+        </w:rPr>
+        <w:t xml:space="preserve">, organizados en filas de 32 bits.</w:t>
       </w:r>
     </w:p>
     <w:p>
@@ -4840,8 +5010,8 @@
     </w:p>
     <w:p>
       <w:pPr>
-        <w:spacing w:after="120" w:line="280"/>
-        <w:jc w:val="both"/>
+        <w:spacing w:after="260" w:line="288"/>
+        <w:jc w:val="center"/>
       </w:pPr>
       <w:r>
         <w:rPr>
@@ -5948,23 +6118,31 @@
       <w:r>
         <w:rPr>
           <w:rFonts w:ascii="Lexend" w:cs="Lexend" w:eastAsia="Lexend" w:hAnsi="Lexend"/>
-          <w:i/>
-          <w:iCs/>
-          <w:color w:val="B00020"/>
-          <w:sz w:val="22"/>
-          <w:szCs w:val="22"/>
-          <w:lang w:val="es-AR"/>
-        </w:rPr>
-        <w:t xml:space="preserve">⚠️ El apunte escribe el desplazamiento en </w:t>
-      </w:r>
-      <w:r>
-        <w:rPr>
-          <w:rFonts w:ascii="Lexend" w:cs="Lexend" w:eastAsia="Lexend" w:hAnsi="Lexend"/>
-          <w:b/>
-          <w:bCs/>
-          <w:i/>
-          <w:iCs/>
-          <w:color w:val="B00020"/>
+          <w:b/>
+          <w:bCs/>
+          <w:color w:val="1A1A1A"/>
+          <w:sz w:val="22"/>
+          <w:szCs w:val="22"/>
+          <w:lang w:val="es-AR"/>
+        </w:rPr>
+        <w:t xml:space="preserve">Ojo:</w:t>
+      </w:r>
+      <w:r>
+        <w:rPr>
+          <w:rFonts w:ascii="Lexend" w:cs="Lexend" w:eastAsia="Lexend" w:hAnsi="Lexend"/>
+          <w:color w:val="1A1A1A"/>
+          <w:sz w:val="22"/>
+          <w:szCs w:val="22"/>
+          <w:lang w:val="es-AR"/>
+        </w:rPr>
+        <w:t xml:space="preserve"> El apunte escribe el desplazamiento en </w:t>
+      </w:r>
+      <w:r>
+        <w:rPr>
+          <w:rFonts w:ascii="Lexend" w:cs="Lexend" w:eastAsia="Lexend" w:hAnsi="Lexend"/>
+          <w:b/>
+          <w:bCs/>
+          <w:color w:val="1A1A1A"/>
           <w:sz w:val="22"/>
           <w:szCs w:val="22"/>
           <w:lang w:val="es-AR"/>
@@ -5974,9 +6152,7 @@
       <w:r>
         <w:rPr>
           <w:rFonts w:ascii="Lexend" w:cs="Lexend" w:eastAsia="Lexend" w:hAnsi="Lexend"/>
-          <w:i/>
-          <w:iCs/>
-          <w:color w:val="B00020"/>
+          <w:color w:val="1A1A1A"/>
           <w:sz w:val="22"/>
           <w:szCs w:val="22"/>
           <w:lang w:val="es-AR"/>
@@ -5988,9 +6164,7 @@
           <w:rFonts w:ascii="Lexend" w:cs="Lexend" w:eastAsia="Lexend" w:hAnsi="Lexend"/>
           <w:b/>
           <w:bCs/>
-          <w:i/>
-          <w:iCs/>
-          <w:color w:val="B00020"/>
+          <w:color w:val="1A1A1A"/>
           <w:sz w:val="22"/>
           <w:szCs w:val="22"/>
           <w:lang w:val="es-AR"/>
@@ -6000,9 +6174,7 @@
       <w:r>
         <w:rPr>
           <w:rFonts w:ascii="Lexend" w:cs="Lexend" w:eastAsia="Lexend" w:hAnsi="Lexend"/>
-          <w:i/>
-          <w:iCs/>
-          <w:color w:val="B00020"/>
+          <w:color w:val="1A1A1A"/>
           <w:sz w:val="22"/>
           <w:szCs w:val="22"/>
           <w:lang w:val="es-AR"/>
@@ -6028,7 +6200,7 @@
           <w:szCs w:val="25"/>
           <w:lang w:val="es-AR"/>
         </w:rPr>
-        <w:t xml:space="preserve">4. DIRECCIONES IP Y SUBNETTING (TANENBAUM 5.6.2) — EL NÚCLEO PRÁCTICO</w:t>
+        <w:t xml:space="preserve">DIRECCIONES IP Y SUBNETTING</w:t>
       </w:r>
     </w:p>
     <w:p>
@@ -8110,7 +8282,7 @@
           <w:szCs w:val="21"/>
           <w:lang w:val="es-AR"/>
         </w:rPr>
-        <w:t xml:space="preserve">MÉTODO (LO QUE SE CALCULA EN EL PARCIAL)</w:t>
+        <w:t xml:space="preserve">MÉTODO DE CÁLCULO</w:t>
       </w:r>
     </w:p>
     <w:p>
@@ -9265,7 +9437,7 @@
           <w:szCs w:val="25"/>
           <w:lang w:val="es-AR"/>
         </w:rPr>
-        <w:t xml:space="preserve">5. PROTOCOLOS DE CONTROL (TANENBAUM 5.6.4) Y COMANDOS DE RED</w:t>
+        <w:t xml:space="preserve">PROTOCOLOS DE CONTROL Y COMANDOS DE RED</w:t>
       </w:r>
     </w:p>
     <w:p>
@@ -9285,7 +9457,7 @@
           <w:szCs w:val="21"/>
           <w:lang w:val="es-AR"/>
         </w:rPr>
-        <w:t xml:space="preserve">ICMP — CAPA 3</w:t>
+        <w:t xml:space="preserve">ICMP</w:t>
       </w:r>
     </w:p>
     <w:p>
@@ -9899,7 +10071,7 @@
           <w:szCs w:val="21"/>
           <w:lang w:val="es-AR"/>
         </w:rPr>
-        <w:t xml:space="preserve">ARP — DE IP A MAC</w:t>
+        <w:t xml:space="preserve">ARP: DE IP A MAC</w:t>
       </w:r>
     </w:p>
     <w:p>
@@ -10396,7 +10568,7 @@
           <w:szCs w:val="22"/>
           <w:lang w:val="es-AR"/>
         </w:rPr>
-        <w:t xml:space="preserve">[Conocimiento general]</w:t>
+        <w:t xml:space="preserve">(conocimiento general)</w:t>
       </w:r>
       <w:r>
         <w:rPr>
@@ -10449,7 +10621,7 @@
           <w:szCs w:val="25"/>
           <w:lang w:val="es-AR"/>
         </w:rPr>
-        <w:t xml:space="preserve">6. OSPF Y BGP (TANENBAUM 5.6.6–5.6.7)</w:t>
+        <w:t xml:space="preserve">OSPF Y BGP</w:t>
       </w:r>
     </w:p>
     <w:p>
@@ -10487,7 +10659,29 @@
           <w:szCs w:val="22"/>
           <w:lang w:val="es-AR"/>
         </w:rPr>
-        <w:t xml:space="preserve">Sistema Autónomo (SA) [Tanenbaum]:</w:t>
+        <w:t xml:space="preserve">Sistema Autónomo (SA):</w:t>
+      </w:r>
+      <w:r>
+        <w:rPr>
+          <w:rFonts w:ascii="Lexend" w:cs="Lexend" w:eastAsia="Lexend" w:hAnsi="Lexend"/>
+          <w:color w:val="1A1A1A"/>
+          <w:sz w:val="22"/>
+          <w:szCs w:val="22"/>
+          <w:lang w:val="es-AR"/>
+        </w:rPr>
+        <w:t xml:space="preserve"> </w:t>
+      </w:r>
+      <w:r>
+        <w:rPr>
+          <w:rFonts w:ascii="Lexend" w:cs="Lexend" w:eastAsia="Lexend" w:hAnsi="Lexend"/>
+          <w:i/>
+          <w:iCs/>
+          <w:color w:val="1A1A1A"/>
+          <w:sz w:val="22"/>
+          <w:szCs w:val="22"/>
+          <w:lang w:val="es-AR"/>
+        </w:rPr>
+        <w:t xml:space="preserve">(Tanenbaum)</w:t>
       </w:r>
       <w:r>
         <w:rPr>
@@ -10724,7 +10918,29 @@
           <w:szCs w:val="22"/>
           <w:lang w:val="es-AR"/>
         </w:rPr>
-        <w:t xml:space="preserve">IGP (Interior Gateway Protocol) [Tanenbaum]:</w:t>
+        <w:t xml:space="preserve">IGP (Interior Gateway Protocol):</w:t>
+      </w:r>
+      <w:r>
+        <w:rPr>
+          <w:rFonts w:ascii="Lexend" w:cs="Lexend" w:eastAsia="Lexend" w:hAnsi="Lexend"/>
+          <w:color w:val="1A1A1A"/>
+          <w:sz w:val="22"/>
+          <w:szCs w:val="22"/>
+          <w:lang w:val="es-AR"/>
+        </w:rPr>
+        <w:t xml:space="preserve"> </w:t>
+      </w:r>
+      <w:r>
+        <w:rPr>
+          <w:rFonts w:ascii="Lexend" w:cs="Lexend" w:eastAsia="Lexend" w:hAnsi="Lexend"/>
+          <w:i/>
+          <w:iCs/>
+          <w:color w:val="1A1A1A"/>
+          <w:sz w:val="22"/>
+          <w:szCs w:val="22"/>
+          <w:lang w:val="es-AR"/>
+        </w:rPr>
+        <w:t xml:space="preserve">(Tanenbaum)</w:t>
       </w:r>
       <w:r>
         <w:rPr>
@@ -11130,7 +11346,7 @@
           <w:szCs w:val="22"/>
           <w:lang w:val="es-AR"/>
         </w:rPr>
-        <w:t xml:space="preserve">[conocimiento general]</w:t>
+        <w:t xml:space="preserve">(conocimiento general)</w:t>
       </w:r>
       <w:r>
         <w:rPr>
@@ -11160,7 +11376,7 @@
           <w:szCs w:val="21"/>
           <w:lang w:val="es-AR"/>
         </w:rPr>
-        <w:t xml:space="preserve">OSPF (OPEN SHORTEST PATH FIRST)</w:t>
+        <w:t xml:space="preserve">OSPF</w:t>
       </w:r>
     </w:p>
     <w:p>
@@ -11221,7 +11437,7 @@
           <w:szCs w:val="22"/>
           <w:lang w:val="es-AR"/>
         </w:rPr>
-        <w:t xml:space="preserve">, con los 5 pasos de la sección 2 y Dijkstra. </w:t>
+        <w:t xml:space="preserve">, con los 5 pasos explicados en Ruteo y Dijkstra. </w:t>
       </w:r>
       <w:r>
         <w:rPr>
@@ -11536,7 +11752,7 @@
           <w:szCs w:val="22"/>
           <w:lang w:val="es-AR"/>
         </w:rPr>
-        <w:t xml:space="preserve">[Tanenbaum]</w:t>
+        <w:t xml:space="preserve">(Tanenbaum)</w:t>
       </w:r>
       <w:r>
         <w:rPr>
@@ -11848,7 +12064,29 @@
           <w:szCs w:val="22"/>
           <w:lang w:val="es-AR"/>
         </w:rPr>
-        <w:t xml:space="preserve">Qué quiere decir que reconoce jerarquías [Tanenbaum]:</w:t>
+        <w:t xml:space="preserve">Qué quiere decir que reconoce jerarquías:</w:t>
+      </w:r>
+      <w:r>
+        <w:rPr>
+          <w:rFonts w:ascii="Lexend" w:cs="Lexend" w:eastAsia="Lexend" w:hAnsi="Lexend"/>
+          <w:color w:val="1A1A1A"/>
+          <w:sz w:val="22"/>
+          <w:szCs w:val="22"/>
+          <w:lang w:val="es-AR"/>
+        </w:rPr>
+        <w:t xml:space="preserve"> </w:t>
+      </w:r>
+      <w:r>
+        <w:rPr>
+          <w:rFonts w:ascii="Lexend" w:cs="Lexend" w:eastAsia="Lexend" w:hAnsi="Lexend"/>
+          <w:i/>
+          <w:iCs/>
+          <w:color w:val="1A1A1A"/>
+          <w:sz w:val="22"/>
+          <w:szCs w:val="22"/>
+          <w:lang w:val="es-AR"/>
+        </w:rPr>
+        <w:t xml:space="preserve">(Tanenbaum)</w:t>
       </w:r>
       <w:r>
         <w:rPr>
@@ -11942,7 +12180,29 @@
           <w:szCs w:val="22"/>
           <w:lang w:val="es-AR"/>
         </w:rPr>
-        <w:t xml:space="preserve">Área y tipos de área [Tanenbaum]:</w:t>
+        <w:t xml:space="preserve">Área y tipos de área:</w:t>
+      </w:r>
+      <w:r>
+        <w:rPr>
+          <w:rFonts w:ascii="Lexend" w:cs="Lexend" w:eastAsia="Lexend" w:hAnsi="Lexend"/>
+          <w:color w:val="1A1A1A"/>
+          <w:sz w:val="22"/>
+          <w:szCs w:val="22"/>
+          <w:lang w:val="es-AR"/>
+        </w:rPr>
+        <w:t xml:space="preserve"> </w:t>
+      </w:r>
+      <w:r>
+        <w:rPr>
+          <w:rFonts w:ascii="Lexend" w:cs="Lexend" w:eastAsia="Lexend" w:hAnsi="Lexend"/>
+          <w:i/>
+          <w:iCs/>
+          <w:color w:val="1A1A1A"/>
+          <w:sz w:val="22"/>
+          <w:szCs w:val="22"/>
+          <w:lang w:val="es-AR"/>
+        </w:rPr>
+        <w:t xml:space="preserve">(Tanenbaum)</w:t>
       </w:r>
       <w:r>
         <w:rPr>
@@ -12162,7 +12422,7 @@
           <w:szCs w:val="22"/>
           <w:lang w:val="es-AR"/>
         </w:rPr>
-        <w:t xml:space="preserve">[Tanenbaum]</w:t>
+        <w:t xml:space="preserve">(Tanenbaum)</w:t>
       </w:r>
       <w:r>
         <w:rPr>
@@ -12280,7 +12540,7 @@
           <w:szCs w:val="21"/>
           <w:lang w:val="es-AR"/>
         </w:rPr>
-        <w:t xml:space="preserve">BGP (BORDER GATEWAY PROTOCOL)</w:t>
+        <w:t xml:space="preserve">BGP</w:t>
       </w:r>
     </w:p>
     <w:p>
@@ -12719,88 +12979,7 @@
           <w:szCs w:val="25"/>
           <w:lang w:val="es-AR"/>
         </w:rPr>
-        <w:t xml:space="preserve">7. GUÍA DE ESTUDIO DE BARÓ — PREGUNTAS Y RESPUESTAS</w:t>
-      </w:r>
-    </w:p>
-    <w:p>
-      <w:pPr>
-        <w:spacing w:after="260" w:before="180" w:line="264"/>
-        <w:ind w:left="454" w:right="454"/>
-        <w:jc w:val="both"/>
-      </w:pPr>
-      <w:r>
-        <w:rPr>
-          <w:rFonts w:ascii="Lexend" w:cs="Lexend" w:eastAsia="Lexend" w:hAnsi="Lexend"/>
-          <w:color w:val="1A1A1A"/>
-          <w:sz w:val="20"/>
-          <w:szCs w:val="20"/>
-          <w:lang w:val="es-AR"/>
-        </w:rPr>
-        <w:t xml:space="preserve">Las preguntas son </w:t>
-      </w:r>
-      <w:r>
-        <w:rPr>
-          <w:rFonts w:ascii="Lexend" w:cs="Lexend" w:eastAsia="Lexend" w:hAnsi="Lexend"/>
-          <w:b/>
-          <w:bCs/>
-          <w:color w:val="1A1A1A"/>
-          <w:sz w:val="20"/>
-          <w:szCs w:val="20"/>
-          <w:lang w:val="es-AR"/>
-        </w:rPr>
-        <w:t xml:space="preserve">textuales</w:t>
-      </w:r>
-      <w:r>
-        <w:rPr>
-          <w:rFonts w:ascii="Lexend" w:cs="Lexend" w:eastAsia="Lexend" w:hAnsi="Lexend"/>
-          <w:color w:val="1A1A1A"/>
-          <w:sz w:val="20"/>
-          <w:szCs w:val="20"/>
-          <w:lang w:val="es-AR"/>
-        </w:rPr>
-        <w:t xml:space="preserve"> de la guía de Baró (</w:t>
-      </w:r>
-      <w:r>
-        <w:rPr>
-          <w:rFonts w:ascii="Consolas" w:cs="Consolas" w:eastAsia="Consolas" w:hAnsi="Consolas"/>
-          <w:color w:val="1A1A1A"/>
-          <w:sz w:val="18"/>
-          <w:szCs w:val="18"/>
-          <w:lang w:val="es-AR"/>
-        </w:rPr>
-        <w:t xml:space="preserve">GUIA DE ESTUDIO DE CAPA DE RED.docx</w:t>
-      </w:r>
-      <w:r>
-        <w:rPr>
-          <w:rFonts w:ascii="Lexend" w:cs="Lexend" w:eastAsia="Lexend" w:hAnsi="Lexend"/>
-          <w:color w:val="1A1A1A"/>
-          <w:sz w:val="20"/>
-          <w:szCs w:val="20"/>
-          <w:lang w:val="es-AR"/>
-        </w:rPr>
-        <w:t xml:space="preserve">). Lo marcado </w:t>
-      </w:r>
-      <w:r>
-        <w:rPr>
-          <w:rFonts w:ascii="Lexend" w:cs="Lexend" w:eastAsia="Lexend" w:hAnsi="Lexend"/>
-          <w:b/>
-          <w:bCs/>
-          <w:color w:val="1A1A1A"/>
-          <w:sz w:val="20"/>
-          <w:szCs w:val="20"/>
-          <w:lang w:val="es-AR"/>
-        </w:rPr>
-        <w:t xml:space="preserve">[Tanenbaum]</w:t>
-      </w:r>
-      <w:r>
-        <w:rPr>
-          <w:rFonts w:ascii="Lexend" w:cs="Lexend" w:eastAsia="Lexend" w:hAnsi="Lexend"/>
-          <w:color w:val="1A1A1A"/>
-          <w:sz w:val="20"/>
-          <w:szCs w:val="20"/>
-          <w:lang w:val="es-AR"/>
-        </w:rPr>
-        <w:t xml:space="preserve"> no está en tus fuentes: lo completé con el contenido del libro.</w:t>
+        <w:t xml:space="preserve">PREGUNTAS DE LA GUÍA DE ESTUDIO</w:t>
       </w:r>
     </w:p>
     <w:p>
@@ -12838,7 +13017,7 @@
           <w:szCs w:val="22"/>
           <w:lang w:val="es-AR"/>
         </w:rPr>
-        <w:t xml:space="preserve">P1. ¿Qué campo/subcampo de la Cabecera IP indica la prioridad del datagrama?</w:t>
+        <w:t xml:space="preserve">1) ¿Qué campo/subcampo de la Cabecera IP indica la prioridad del datagrama?</w:t>
       </w:r>
     </w:p>
     <w:p>
@@ -12849,24 +13028,12 @@
       <w:r>
         <w:rPr>
           <w:rFonts w:ascii="Lexend" w:cs="Lexend" w:eastAsia="Lexend" w:hAnsi="Lexend"/>
-          <w:b/>
-          <w:bCs/>
-          <w:color w:val="1A1A1A"/>
-          <w:sz w:val="22"/>
-          <w:szCs w:val="22"/>
-          <w:lang w:val="es-AR"/>
-        </w:rPr>
-        <w:t xml:space="preserve">R:</w:t>
-      </w:r>
-      <w:r>
-        <w:rPr>
-          <w:rFonts w:ascii="Lexend" w:cs="Lexend" w:eastAsia="Lexend" w:hAnsi="Lexend"/>
-          <w:color w:val="1A1A1A"/>
-          <w:sz w:val="22"/>
-          <w:szCs w:val="22"/>
-          <w:lang w:val="es-AR"/>
-        </w:rPr>
-        <w:t xml:space="preserve"> El subcampo </w:t>
+          <w:color w:val="1A1A1A"/>
+          <w:sz w:val="22"/>
+          <w:szCs w:val="22"/>
+          <w:lang w:val="es-AR"/>
+        </w:rPr>
+        <w:t xml:space="preserve">El subcampo </w:t>
       </w:r>
       <w:r>
         <w:rPr>
@@ -12972,7 +13139,7 @@
           <w:szCs w:val="22"/>
           <w:lang w:val="es-AR"/>
         </w:rPr>
-        <w:t xml:space="preserve">P2. El indicador "T" dentro del campo Tipo de Servicio del Datagrama IP tiene una finalidad específica, ¿cuál es?</w:t>
+        <w:t xml:space="preserve">2) El indicador "T" dentro del campo Tipo de Servicio del Datagrama IP tiene una finalidad específica, ¿cuál es?</w:t>
       </w:r>
     </w:p>
     <w:p>
@@ -12983,24 +13150,12 @@
       <w:r>
         <w:rPr>
           <w:rFonts w:ascii="Lexend" w:cs="Lexend" w:eastAsia="Lexend" w:hAnsi="Lexend"/>
-          <w:b/>
-          <w:bCs/>
-          <w:color w:val="1A1A1A"/>
-          <w:sz w:val="22"/>
-          <w:szCs w:val="22"/>
-          <w:lang w:val="es-AR"/>
-        </w:rPr>
-        <w:t xml:space="preserve">R:</w:t>
-      </w:r>
-      <w:r>
-        <w:rPr>
-          <w:rFonts w:ascii="Lexend" w:cs="Lexend" w:eastAsia="Lexend" w:hAnsi="Lexend"/>
-          <w:color w:val="1A1A1A"/>
-          <w:sz w:val="22"/>
-          <w:szCs w:val="22"/>
-          <w:lang w:val="es-AR"/>
-        </w:rPr>
-        <w:t xml:space="preserve"> El bit *</w:t>
+          <w:color w:val="1A1A1A"/>
+          <w:sz w:val="22"/>
+          <w:szCs w:val="22"/>
+          <w:lang w:val="es-AR"/>
+        </w:rPr>
+        <w:t xml:space="preserve">El bit *</w:t>
       </w:r>
       <w:r>
         <w:rPr>
@@ -13216,7 +13371,7 @@
           <w:szCs w:val="22"/>
           <w:lang w:val="es-AR"/>
         </w:rPr>
-        <w:t xml:space="preserve">P3. Dentro del Campo de Opciones del datagrama IP existe una opción que se utiliza como "registro de ruta", ¿cuál es su utilidad?</w:t>
+        <w:t xml:space="preserve">3) Dentro del Campo de Opciones del datagrama IP existe una opción que se utiliza como "registro de ruta", ¿cuál es su utilidad?</w:t>
       </w:r>
     </w:p>
     <w:p>
@@ -13227,24 +13382,12 @@
       <w:r>
         <w:rPr>
           <w:rFonts w:ascii="Lexend" w:cs="Lexend" w:eastAsia="Lexend" w:hAnsi="Lexend"/>
-          <w:b/>
-          <w:bCs/>
-          <w:color w:val="1A1A1A"/>
-          <w:sz w:val="22"/>
-          <w:szCs w:val="22"/>
-          <w:lang w:val="es-AR"/>
-        </w:rPr>
-        <w:t xml:space="preserve">R:</w:t>
-      </w:r>
-      <w:r>
-        <w:rPr>
-          <w:rFonts w:ascii="Lexend" w:cs="Lexend" w:eastAsia="Lexend" w:hAnsi="Lexend"/>
-          <w:color w:val="1A1A1A"/>
-          <w:sz w:val="22"/>
-          <w:szCs w:val="22"/>
-          <w:lang w:val="es-AR"/>
-        </w:rPr>
-        <w:t xml:space="preserve"> Cada router por el que pasa el datagrama </w:t>
+          <w:color w:val="1A1A1A"/>
+          <w:sz w:val="22"/>
+          <w:szCs w:val="22"/>
+          <w:lang w:val="es-AR"/>
+        </w:rPr>
+        <w:t xml:space="preserve">Cada router por el que pasa el datagrama </w:t>
       </w:r>
       <w:r>
         <w:rPr>
@@ -13350,7 +13493,7 @@
           <w:szCs w:val="22"/>
           <w:lang w:val="es-AR"/>
         </w:rPr>
-        <w:t xml:space="preserve">P4. ¿Cuál es la función/utilidad de definir rangos de direcciones privadas dentro de cada clase de direcciones IP?</w:t>
+        <w:t xml:space="preserve">4) ¿Cuál es la función/utilidad de definir rangos de direcciones privadas dentro de cada clase de direcciones IP?</w:t>
       </w:r>
     </w:p>
     <w:p>
@@ -13361,24 +13504,12 @@
       <w:r>
         <w:rPr>
           <w:rFonts w:ascii="Lexend" w:cs="Lexend" w:eastAsia="Lexend" w:hAnsi="Lexend"/>
-          <w:b/>
-          <w:bCs/>
-          <w:color w:val="1A1A1A"/>
-          <w:sz w:val="22"/>
-          <w:szCs w:val="22"/>
-          <w:lang w:val="es-AR"/>
-        </w:rPr>
-        <w:t xml:space="preserve">R:</w:t>
-      </w:r>
-      <w:r>
-        <w:rPr>
-          <w:rFonts w:ascii="Lexend" w:cs="Lexend" w:eastAsia="Lexend" w:hAnsi="Lexend"/>
-          <w:color w:val="1A1A1A"/>
-          <w:sz w:val="22"/>
-          <w:szCs w:val="22"/>
-          <w:lang w:val="es-AR"/>
-        </w:rPr>
-        <w:t xml:space="preserve"> Permiten armar </w:t>
+          <w:color w:val="1A1A1A"/>
+          <w:sz w:val="22"/>
+          <w:szCs w:val="22"/>
+          <w:lang w:val="es-AR"/>
+        </w:rPr>
+        <w:t xml:space="preserve">Permiten armar </w:t>
       </w:r>
       <w:r>
         <w:rPr>
@@ -13675,7 +13806,7 @@
           <w:szCs w:val="22"/>
           <w:lang w:val="es-AR"/>
         </w:rPr>
-        <w:t xml:space="preserve">P1. ¿Con qué finalidad se realiza una petición ARP dentro de una LAN?</w:t>
+        <w:t xml:space="preserve">1) ¿Con qué finalidad se realiza una petición ARP dentro de una LAN?</w:t>
       </w:r>
     </w:p>
     <w:p>
@@ -13686,24 +13817,12 @@
       <w:r>
         <w:rPr>
           <w:rFonts w:ascii="Lexend" w:cs="Lexend" w:eastAsia="Lexend" w:hAnsi="Lexend"/>
-          <w:b/>
-          <w:bCs/>
-          <w:color w:val="1A1A1A"/>
-          <w:sz w:val="22"/>
-          <w:szCs w:val="22"/>
-          <w:lang w:val="es-AR"/>
-        </w:rPr>
-        <w:t xml:space="preserve">R:</w:t>
-      </w:r>
-      <w:r>
-        <w:rPr>
-          <w:rFonts w:ascii="Lexend" w:cs="Lexend" w:eastAsia="Lexend" w:hAnsi="Lexend"/>
-          <w:color w:val="1A1A1A"/>
-          <w:sz w:val="22"/>
-          <w:szCs w:val="22"/>
-          <w:lang w:val="es-AR"/>
-        </w:rPr>
-        <w:t xml:space="preserve"> Para obtener la </w:t>
+          <w:color w:val="1A1A1A"/>
+          <w:sz w:val="22"/>
+          <w:szCs w:val="22"/>
+          <w:lang w:val="es-AR"/>
+        </w:rPr>
+        <w:t xml:space="preserve">Para obtener la </w:t>
       </w:r>
       <w:r>
         <w:rPr>
@@ -13853,7 +13972,7 @@
           <w:szCs w:val="22"/>
           <w:lang w:val="es-AR"/>
         </w:rPr>
-        <w:t xml:space="preserve">P2. ¿A qué capa del modelo OSI pertenece el protocolo ICMP?</w:t>
+        <w:t xml:space="preserve">2) ¿A qué capa del modelo OSI pertenece el protocolo ICMP?</w:t>
       </w:r>
     </w:p>
     <w:p>
@@ -13864,24 +13983,12 @@
       <w:r>
         <w:rPr>
           <w:rFonts w:ascii="Lexend" w:cs="Lexend" w:eastAsia="Lexend" w:hAnsi="Lexend"/>
-          <w:b/>
-          <w:bCs/>
-          <w:color w:val="1A1A1A"/>
-          <w:sz w:val="22"/>
-          <w:szCs w:val="22"/>
-          <w:lang w:val="es-AR"/>
-        </w:rPr>
-        <w:t xml:space="preserve">R:</w:t>
-      </w:r>
-      <w:r>
-        <w:rPr>
-          <w:rFonts w:ascii="Lexend" w:cs="Lexend" w:eastAsia="Lexend" w:hAnsi="Lexend"/>
-          <w:color w:val="1A1A1A"/>
-          <w:sz w:val="22"/>
-          <w:szCs w:val="22"/>
-          <w:lang w:val="es-AR"/>
-        </w:rPr>
-        <w:t xml:space="preserve"> A la </w:t>
+          <w:color w:val="1A1A1A"/>
+          <w:sz w:val="22"/>
+          <w:szCs w:val="22"/>
+          <w:lang w:val="es-AR"/>
+        </w:rPr>
+        <w:t xml:space="preserve">A la </w:t>
       </w:r>
       <w:r>
         <w:rPr>
@@ -13943,7 +14050,7 @@
           <w:szCs w:val="22"/>
           <w:lang w:val="es-AR"/>
         </w:rPr>
-        <w:t xml:space="preserve">P3. Cuando se utilizan las opciones de cabecera "Registro de Ruta" y "Marca de Tiempo", ¿qué protocolo de control se utiliza?</w:t>
+        <w:t xml:space="preserve">3) Cuando se utilizan las opciones de cabecera "Registro de Ruta" y "Marca de Tiempo", ¿qué protocolo de control se utiliza?</w:t>
       </w:r>
     </w:p>
     <w:p>
@@ -13951,28 +14058,6 @@
         <w:spacing w:after="120" w:line="280"/>
         <w:jc w:val="both"/>
       </w:pPr>
-      <w:r>
-        <w:rPr>
-          <w:rFonts w:ascii="Lexend" w:cs="Lexend" w:eastAsia="Lexend" w:hAnsi="Lexend"/>
-          <w:b/>
-          <w:bCs/>
-          <w:color w:val="1A1A1A"/>
-          <w:sz w:val="22"/>
-          <w:szCs w:val="22"/>
-          <w:lang w:val="es-AR"/>
-        </w:rPr>
-        <w:t xml:space="preserve">R:</w:t>
-      </w:r>
-      <w:r>
-        <w:rPr>
-          <w:rFonts w:ascii="Lexend" w:cs="Lexend" w:eastAsia="Lexend" w:hAnsi="Lexend"/>
-          <w:color w:val="1A1A1A"/>
-          <w:sz w:val="22"/>
-          <w:szCs w:val="22"/>
-          <w:lang w:val="es-AR"/>
-        </w:rPr>
-        <w:t xml:space="preserve"> </w:t>
-      </w:r>
       <w:r>
         <w:rPr>
           <w:rFonts w:ascii="Lexend" w:cs="Lexend" w:eastAsia="Lexend" w:hAnsi="Lexend"/>
@@ -14139,7 +14224,7 @@
           <w:szCs w:val="22"/>
           <w:lang w:val="es-AR"/>
         </w:rPr>
-        <w:t xml:space="preserve">P1. Defina el concepto de Ruteo en Internet.</w:t>
+        <w:t xml:space="preserve">1) Defina el concepto de Ruteo en Internet.</w:t>
       </w:r>
     </w:p>
     <w:p>
@@ -14150,24 +14235,12 @@
       <w:r>
         <w:rPr>
           <w:rFonts w:ascii="Lexend" w:cs="Lexend" w:eastAsia="Lexend" w:hAnsi="Lexend"/>
-          <w:b/>
-          <w:bCs/>
-          <w:color w:val="1A1A1A"/>
-          <w:sz w:val="22"/>
-          <w:szCs w:val="22"/>
-          <w:lang w:val="es-AR"/>
-        </w:rPr>
-        <w:t xml:space="preserve">R:</w:t>
-      </w:r>
-      <w:r>
-        <w:rPr>
-          <w:rFonts w:ascii="Lexend" w:cs="Lexend" w:eastAsia="Lexend" w:hAnsi="Lexend"/>
-          <w:color w:val="1A1A1A"/>
-          <w:sz w:val="22"/>
-          <w:szCs w:val="22"/>
-          <w:lang w:val="es-AR"/>
-        </w:rPr>
-        <w:t xml:space="preserve"> Es el proceso por el cual los </w:t>
+          <w:color w:val="1A1A1A"/>
+          <w:sz w:val="22"/>
+          <w:szCs w:val="22"/>
+          <w:lang w:val="es-AR"/>
+        </w:rPr>
+        <w:t xml:space="preserve">Es el proceso por el cual los </w:t>
       </w:r>
       <w:r>
         <w:rPr>
@@ -14282,14 +14355,14 @@
       <w:r>
         <w:rPr>
           <w:rFonts w:ascii="Lexend" w:cs="Lexend" w:eastAsia="Lexend" w:hAnsi="Lexend"/>
-          <w:b/>
-          <w:bCs/>
-          <w:color w:val="1A1A1A"/>
-          <w:sz w:val="22"/>
-          <w:szCs w:val="22"/>
-          <w:lang w:val="es-AR"/>
-        </w:rPr>
-        <w:t xml:space="preserve">[Tanenbaum]</w:t>
+          <w:i/>
+          <w:iCs/>
+          <w:color w:val="1A1A1A"/>
+          <w:sz w:val="22"/>
+          <w:szCs w:val="22"/>
+          <w:lang w:val="es-AR"/>
+        </w:rPr>
+        <w:t xml:space="preserve">(Tanenbaum)</w:t>
       </w:r>
     </w:p>
     <w:p>
@@ -14307,7 +14380,7 @@
           <w:szCs w:val="22"/>
           <w:lang w:val="es-AR"/>
         </w:rPr>
-        <w:t xml:space="preserve">P2. ¿En qué consiste una Tabla de Ruteo? ¿Quién la arma?</w:t>
+        <w:t xml:space="preserve">2) ¿En qué consiste una Tabla de Ruteo? ¿Quién la arma?</w:t>
       </w:r>
     </w:p>
     <w:p>
@@ -14318,24 +14391,12 @@
       <w:r>
         <w:rPr>
           <w:rFonts w:ascii="Lexend" w:cs="Lexend" w:eastAsia="Lexend" w:hAnsi="Lexend"/>
-          <w:b/>
-          <w:bCs/>
-          <w:color w:val="1A1A1A"/>
-          <w:sz w:val="22"/>
-          <w:szCs w:val="22"/>
-          <w:lang w:val="es-AR"/>
-        </w:rPr>
-        <w:t xml:space="preserve">R:</w:t>
-      </w:r>
-      <w:r>
-        <w:rPr>
-          <w:rFonts w:ascii="Lexend" w:cs="Lexend" w:eastAsia="Lexend" w:hAnsi="Lexend"/>
-          <w:color w:val="1A1A1A"/>
-          <w:sz w:val="22"/>
-          <w:szCs w:val="22"/>
-          <w:lang w:val="es-AR"/>
-        </w:rPr>
-        <w:t xml:space="preserve"> Es la tabla del router que asocia cada </w:t>
+          <w:color w:val="1A1A1A"/>
+          <w:sz w:val="22"/>
+          <w:szCs w:val="22"/>
+          <w:lang w:val="es-AR"/>
+        </w:rPr>
+        <w:t xml:space="preserve">Es la tabla del router que asocia cada </w:t>
       </w:r>
       <w:r>
         <w:rPr>
@@ -14450,14 +14511,14 @@
       <w:r>
         <w:rPr>
           <w:rFonts w:ascii="Lexend" w:cs="Lexend" w:eastAsia="Lexend" w:hAnsi="Lexend"/>
-          <w:b/>
-          <w:bCs/>
-          <w:color w:val="1A1A1A"/>
-          <w:sz w:val="22"/>
-          <w:szCs w:val="22"/>
-          <w:lang w:val="es-AR"/>
-        </w:rPr>
-        <w:t xml:space="preserve">[Tanenbaum]</w:t>
+          <w:i/>
+          <w:iCs/>
+          <w:color w:val="1A1A1A"/>
+          <w:sz w:val="22"/>
+          <w:szCs w:val="22"/>
+          <w:lang w:val="es-AR"/>
+        </w:rPr>
+        <w:t xml:space="preserve">(Tanenbaum)</w:t>
       </w:r>
     </w:p>
     <w:p>
@@ -14475,7 +14536,7 @@
           <w:szCs w:val="22"/>
           <w:lang w:val="es-AR"/>
         </w:rPr>
-        <w:t xml:space="preserve">P3. ¿Qué es una ruta default? ¿Por qué motivo existe dicha entrada dentro de la Tabla de Ruteo?</w:t>
+        <w:t xml:space="preserve">3) ¿Qué es una ruta default? ¿Por qué motivo existe dicha entrada dentro de la Tabla de Ruteo?</w:t>
       </w:r>
     </w:p>
     <w:p>
@@ -14486,24 +14547,12 @@
       <w:r>
         <w:rPr>
           <w:rFonts w:ascii="Lexend" w:cs="Lexend" w:eastAsia="Lexend" w:hAnsi="Lexend"/>
-          <w:b/>
-          <w:bCs/>
-          <w:color w:val="1A1A1A"/>
-          <w:sz w:val="22"/>
-          <w:szCs w:val="22"/>
-          <w:lang w:val="es-AR"/>
-        </w:rPr>
-        <w:t xml:space="preserve">R:</w:t>
-      </w:r>
-      <w:r>
-        <w:rPr>
-          <w:rFonts w:ascii="Lexend" w:cs="Lexend" w:eastAsia="Lexend" w:hAnsi="Lexend"/>
-          <w:color w:val="1A1A1A"/>
-          <w:sz w:val="22"/>
-          <w:szCs w:val="22"/>
-          <w:lang w:val="es-AR"/>
-        </w:rPr>
-        <w:t xml:space="preserve"> Es la entrada que se usa </w:t>
+          <w:color w:val="1A1A1A"/>
+          <w:sz w:val="22"/>
+          <w:szCs w:val="22"/>
+          <w:lang w:val="es-AR"/>
+        </w:rPr>
+        <w:t xml:space="preserve">Es la entrada que se usa </w:t>
       </w:r>
       <w:r>
         <w:rPr>
@@ -14594,14 +14643,14 @@
       <w:r>
         <w:rPr>
           <w:rFonts w:ascii="Lexend" w:cs="Lexend" w:eastAsia="Lexend" w:hAnsi="Lexend"/>
-          <w:b/>
-          <w:bCs/>
-          <w:color w:val="1A1A1A"/>
-          <w:sz w:val="22"/>
-          <w:szCs w:val="22"/>
-          <w:lang w:val="es-AR"/>
-        </w:rPr>
-        <w:t xml:space="preserve">[Tanenbaum]</w:t>
+          <w:i/>
+          <w:iCs/>
+          <w:color w:val="1A1A1A"/>
+          <w:sz w:val="22"/>
+          <w:szCs w:val="22"/>
+          <w:lang w:val="es-AR"/>
+        </w:rPr>
+        <w:t xml:space="preserve">(Tanenbaum)</w:t>
       </w:r>
     </w:p>
     <w:p>
@@ -14619,7 +14668,7 @@
           <w:szCs w:val="22"/>
           <w:lang w:val="es-AR"/>
         </w:rPr>
-        <w:t xml:space="preserve">P4. ¿En qué consiste un Sistema Autónomo? ¿Cómo está conformado? Describa.</w:t>
+        <w:t xml:space="preserve">4) ¿En qué consiste un Sistema Autónomo? ¿Cómo está conformado? Describa.</w:t>
       </w:r>
     </w:p>
     <w:p>
@@ -14630,24 +14679,12 @@
       <w:r>
         <w:rPr>
           <w:rFonts w:ascii="Lexend" w:cs="Lexend" w:eastAsia="Lexend" w:hAnsi="Lexend"/>
-          <w:b/>
-          <w:bCs/>
-          <w:color w:val="1A1A1A"/>
-          <w:sz w:val="22"/>
-          <w:szCs w:val="22"/>
-          <w:lang w:val="es-AR"/>
-        </w:rPr>
-        <w:t xml:space="preserve">R:</w:t>
-      </w:r>
-      <w:r>
-        <w:rPr>
-          <w:rFonts w:ascii="Lexend" w:cs="Lexend" w:eastAsia="Lexend" w:hAnsi="Lexend"/>
-          <w:color w:val="1A1A1A"/>
-          <w:sz w:val="22"/>
-          <w:szCs w:val="22"/>
-          <w:lang w:val="es-AR"/>
-        </w:rPr>
-        <w:t xml:space="preserve"> Es una red o un conjunto de redes </w:t>
+          <w:color w:val="1A1A1A"/>
+          <w:sz w:val="22"/>
+          <w:szCs w:val="22"/>
+          <w:lang w:val="es-AR"/>
+        </w:rPr>
+        <w:t xml:space="preserve">Es una red o un conjunto de redes </w:t>
       </w:r>
       <w:r>
         <w:rPr>
@@ -14862,6 +14899,24 @@
     </w:p>
     <w:p>
       <w:pPr>
+        <w:spacing w:after="120" w:line="280"/>
+        <w:jc w:val="both"/>
+      </w:pPr>
+      <w:r>
+        <w:rPr>
+          <w:rFonts w:ascii="Lexend" w:cs="Lexend" w:eastAsia="Lexend" w:hAnsi="Lexend"/>
+          <w:i/>
+          <w:iCs/>
+          <w:color w:val="1A1A1A"/>
+          <w:sz w:val="22"/>
+          <w:szCs w:val="22"/>
+          <w:lang w:val="es-AR"/>
+        </w:rPr>
+        <w:t xml:space="preserve">(Tanenbaum)</w:t>
+      </w:r>
+    </w:p>
+    <w:p>
+      <w:pPr>
         <w:spacing w:after="260" w:line="288"/>
         <w:jc w:val="center"/>
       </w:pPr>
@@ -14875,25 +14930,7 @@
           <w:szCs w:val="22"/>
           <w:lang w:val="es-AR"/>
         </w:rPr>
-        <w:t xml:space="preserve">[Tanenbaum]</w:t>
-      </w:r>
-    </w:p>
-    <w:p>
-      <w:pPr>
-        <w:spacing w:after="260" w:line="288"/>
-        <w:jc w:val="center"/>
-      </w:pPr>
-      <w:r>
-        <w:rPr>
-          <w:rFonts w:ascii="Lexend" w:cs="Lexend" w:eastAsia="Lexend" w:hAnsi="Lexend"/>
-          <w:b/>
-          <w:bCs/>
-          <w:color w:val="1A1A1A"/>
-          <w:sz w:val="22"/>
-          <w:szCs w:val="22"/>
-          <w:lang w:val="es-AR"/>
-        </w:rPr>
-        <w:t xml:space="preserve">P5. ¿Qué es un IGP? Funciones que cumple y entorno de aplicación.</w:t>
+        <w:t xml:space="preserve">5) ¿Qué es un IGP? Funciones que cumple y entorno de aplicación.</w:t>
       </w:r>
     </w:p>
     <w:p>
@@ -14904,24 +14941,12 @@
       <w:r>
         <w:rPr>
           <w:rFonts w:ascii="Lexend" w:cs="Lexend" w:eastAsia="Lexend" w:hAnsi="Lexend"/>
-          <w:b/>
-          <w:bCs/>
-          <w:color w:val="1A1A1A"/>
-          <w:sz w:val="22"/>
-          <w:szCs w:val="22"/>
-          <w:lang w:val="es-AR"/>
-        </w:rPr>
-        <w:t xml:space="preserve">R:</w:t>
-      </w:r>
-      <w:r>
-        <w:rPr>
-          <w:rFonts w:ascii="Lexend" w:cs="Lexend" w:eastAsia="Lexend" w:hAnsi="Lexend"/>
-          <w:color w:val="1A1A1A"/>
-          <w:sz w:val="22"/>
-          <w:szCs w:val="22"/>
-          <w:lang w:val="es-AR"/>
-        </w:rPr>
-        <w:t xml:space="preserve"> Un </w:t>
+          <w:color w:val="1A1A1A"/>
+          <w:sz w:val="22"/>
+          <w:szCs w:val="22"/>
+          <w:lang w:val="es-AR"/>
+        </w:rPr>
+        <w:t xml:space="preserve">Un </w:t>
       </w:r>
       <w:r>
         <w:rPr>
@@ -15239,14 +15264,14 @@
       <w:r>
         <w:rPr>
           <w:rFonts w:ascii="Lexend" w:cs="Lexend" w:eastAsia="Lexend" w:hAnsi="Lexend"/>
-          <w:b/>
-          <w:bCs/>
-          <w:color w:val="1A1A1A"/>
-          <w:sz w:val="22"/>
-          <w:szCs w:val="22"/>
-          <w:lang w:val="es-AR"/>
-        </w:rPr>
-        <w:t xml:space="preserve">[Tanenbaum]</w:t>
+          <w:i/>
+          <w:iCs/>
+          <w:color w:val="1A1A1A"/>
+          <w:sz w:val="22"/>
+          <w:szCs w:val="22"/>
+          <w:lang w:val="es-AR"/>
+        </w:rPr>
+        <w:t xml:space="preserve">(Tanenbaum)</w:t>
       </w:r>
     </w:p>
     <w:p>
@@ -15264,25 +15289,7 @@
           <w:szCs w:val="22"/>
           <w:lang w:val="es-AR"/>
         </w:rPr>
-        <w:t xml:space="preserve">P6. ¿Qué diferencia operativa existe entre un protocolo de Vector Distancia y uno de Estado de Enlace?</w:t>
-      </w:r>
-    </w:p>
-    <w:p>
-      <w:pPr>
-        <w:spacing w:after="260" w:line="288"/>
-        <w:jc w:val="center"/>
-      </w:pPr>
-      <w:r>
-        <w:rPr>
-          <w:rFonts w:ascii="Lexend" w:cs="Lexend" w:eastAsia="Lexend" w:hAnsi="Lexend"/>
-          <w:b/>
-          <w:bCs/>
-          <w:color w:val="1A1A1A"/>
-          <w:sz w:val="22"/>
-          <w:szCs w:val="22"/>
-          <w:lang w:val="es-AR"/>
-        </w:rPr>
-        <w:t xml:space="preserve">R:</w:t>
+        <w:t xml:space="preserve">6) ¿Qué diferencia operativa existe entre un protocolo de Vector Distancia y uno de Estado de Enlace?</w:t>
       </w:r>
     </w:p>
     <w:p>
@@ -15586,7 +15593,7 @@
           <w:szCs w:val="22"/>
           <w:lang w:val="es-AR"/>
         </w:rPr>
-        <w:t xml:space="preserve">P7. ¿Qué es una Métrica y para qué sirve? Dé ejemplos.</w:t>
+        <w:t xml:space="preserve">7) ¿Qué es una Métrica y para qué sirve? Dé ejemplos.</w:t>
       </w:r>
     </w:p>
     <w:p>
@@ -15597,24 +15604,12 @@
       <w:r>
         <w:rPr>
           <w:rFonts w:ascii="Lexend" w:cs="Lexend" w:eastAsia="Lexend" w:hAnsi="Lexend"/>
-          <w:b/>
-          <w:bCs/>
-          <w:color w:val="1A1A1A"/>
-          <w:sz w:val="22"/>
-          <w:szCs w:val="22"/>
-          <w:lang w:val="es-AR"/>
-        </w:rPr>
-        <w:t xml:space="preserve">R:</w:t>
-      </w:r>
-      <w:r>
-        <w:rPr>
-          <w:rFonts w:ascii="Lexend" w:cs="Lexend" w:eastAsia="Lexend" w:hAnsi="Lexend"/>
-          <w:color w:val="1A1A1A"/>
-          <w:sz w:val="22"/>
-          <w:szCs w:val="22"/>
-          <w:lang w:val="es-AR"/>
-        </w:rPr>
-        <w:t xml:space="preserve"> Es el </w:t>
+          <w:color w:val="1A1A1A"/>
+          <w:sz w:val="22"/>
+          <w:szCs w:val="22"/>
+          <w:lang w:val="es-AR"/>
+        </w:rPr>
+        <w:t xml:space="preserve">Es el </w:t>
       </w:r>
       <w:r>
         <w:rPr>
@@ -15852,7 +15847,7 @@
           <w:szCs w:val="22"/>
           <w:lang w:val="es-AR"/>
         </w:rPr>
-        <w:t xml:space="preserve">P8. ¿En qué entorno trabaja el protocolo RIP?</w:t>
+        <w:t xml:space="preserve">8) ¿En qué entorno trabaja el protocolo RIP?</w:t>
       </w:r>
     </w:p>
     <w:p>
@@ -15870,28 +15865,6 @@
           <w:szCs w:val="22"/>
           <w:lang w:val="es-AR"/>
         </w:rPr>
-        <w:t xml:space="preserve">R:</w:t>
-      </w:r>
-      <w:r>
-        <w:rPr>
-          <w:rFonts w:ascii="Lexend" w:cs="Lexend" w:eastAsia="Lexend" w:hAnsi="Lexend"/>
-          <w:color w:val="1A1A1A"/>
-          <w:sz w:val="22"/>
-          <w:szCs w:val="22"/>
-          <w:lang w:val="es-AR"/>
-        </w:rPr>
-        <w:t xml:space="preserve"> </w:t>
-      </w:r>
-      <w:r>
-        <w:rPr>
-          <w:rFonts w:ascii="Lexend" w:cs="Lexend" w:eastAsia="Lexend" w:hAnsi="Lexend"/>
-          <w:b/>
-          <w:bCs/>
-          <w:color w:val="1A1A1A"/>
-          <w:sz w:val="22"/>
-          <w:szCs w:val="22"/>
-          <w:lang w:val="es-AR"/>
-        </w:rPr>
         <w:t xml:space="preserve">Dentro de un Sistema Autónomo</w:t>
       </w:r>
       <w:r>
@@ -16030,7 +16003,7 @@
           <w:szCs w:val="22"/>
           <w:lang w:val="es-AR"/>
         </w:rPr>
-        <w:t xml:space="preserve">P9. ¿Qué principios de funcionamiento tiene el OSPF? ¿Cuáles son las ventajas sobre los protocolos de Vector Distancia?</w:t>
+        <w:t xml:space="preserve">9) ¿Qué principios de funcionamiento tiene el OSPF? ¿Cuáles son las ventajas sobre los protocolos de Vector Distancia?</w:t>
       </w:r>
     </w:p>
     <w:p>
@@ -16041,24 +16014,12 @@
       <w:r>
         <w:rPr>
           <w:rFonts w:ascii="Lexend" w:cs="Lexend" w:eastAsia="Lexend" w:hAnsi="Lexend"/>
-          <w:b/>
-          <w:bCs/>
-          <w:color w:val="1A1A1A"/>
-          <w:sz w:val="22"/>
-          <w:szCs w:val="22"/>
-          <w:lang w:val="es-AR"/>
-        </w:rPr>
-        <w:t xml:space="preserve">R:</w:t>
-      </w:r>
-      <w:r>
-        <w:rPr>
-          <w:rFonts w:ascii="Lexend" w:cs="Lexend" w:eastAsia="Lexend" w:hAnsi="Lexend"/>
-          <w:color w:val="1A1A1A"/>
-          <w:sz w:val="22"/>
-          <w:szCs w:val="22"/>
-          <w:lang w:val="es-AR"/>
-        </w:rPr>
-        <w:t xml:space="preserve"> Principios de funcionamiento:</w:t>
+          <w:color w:val="1A1A1A"/>
+          <w:sz w:val="22"/>
+          <w:szCs w:val="22"/>
+          <w:lang w:val="es-AR"/>
+        </w:rPr>
+        <w:t xml:space="preserve">Principios de funcionamiento:</w:t>
       </w:r>
     </w:p>
     <w:p>
@@ -16711,7 +16672,7 @@
           <w:szCs w:val="22"/>
           <w:lang w:val="es-AR"/>
         </w:rPr>
-        <w:t xml:space="preserve">P10. ¿Qué quiere decir que OSPF reconoce jerarquías de ruteo?</w:t>
+        <w:t xml:space="preserve">10) ¿Qué quiere decir que OSPF reconoce jerarquías de ruteo?</w:t>
       </w:r>
     </w:p>
     <w:p>
@@ -16722,24 +16683,12 @@
       <w:r>
         <w:rPr>
           <w:rFonts w:ascii="Lexend" w:cs="Lexend" w:eastAsia="Lexend" w:hAnsi="Lexend"/>
-          <w:b/>
-          <w:bCs/>
-          <w:color w:val="1A1A1A"/>
-          <w:sz w:val="22"/>
-          <w:szCs w:val="22"/>
-          <w:lang w:val="es-AR"/>
-        </w:rPr>
-        <w:t xml:space="preserve">R:</w:t>
-      </w:r>
-      <w:r>
-        <w:rPr>
-          <w:rFonts w:ascii="Lexend" w:cs="Lexend" w:eastAsia="Lexend" w:hAnsi="Lexend"/>
-          <w:color w:val="1A1A1A"/>
-          <w:sz w:val="22"/>
-          <w:szCs w:val="22"/>
-          <w:lang w:val="es-AR"/>
-        </w:rPr>
-        <w:t xml:space="preserve"> Que divide el Sistema Autónomo en </w:t>
+          <w:color w:val="1A1A1A"/>
+          <w:sz w:val="22"/>
+          <w:szCs w:val="22"/>
+          <w:lang w:val="es-AR"/>
+        </w:rPr>
+        <w:t xml:space="preserve">Que divide el Sistema Autónomo en </w:t>
       </w:r>
       <w:r>
         <w:rPr>
@@ -16854,14 +16803,14 @@
       <w:r>
         <w:rPr>
           <w:rFonts w:ascii="Lexend" w:cs="Lexend" w:eastAsia="Lexend" w:hAnsi="Lexend"/>
-          <w:b/>
-          <w:bCs/>
-          <w:color w:val="1A1A1A"/>
-          <w:sz w:val="22"/>
-          <w:szCs w:val="22"/>
-          <w:lang w:val="es-AR"/>
-        </w:rPr>
-        <w:t xml:space="preserve">[Tanenbaum]</w:t>
+          <w:i/>
+          <w:iCs/>
+          <w:color w:val="1A1A1A"/>
+          <w:sz w:val="22"/>
+          <w:szCs w:val="22"/>
+          <w:lang w:val="es-AR"/>
+        </w:rPr>
+        <w:t xml:space="preserve">(Tanenbaum)</w:t>
       </w:r>
     </w:p>
     <w:p>
@@ -16879,7 +16828,7 @@
           <w:szCs w:val="22"/>
           <w:lang w:val="es-AR"/>
         </w:rPr>
-        <w:t xml:space="preserve">P11. ¿Qué es un área dentro de un Sistema Autónomo y qué tipos de áreas existen?</w:t>
+        <w:t xml:space="preserve">11) ¿Qué es un área dentro de un Sistema Autónomo y qué tipos de áreas existen?</w:t>
       </w:r>
     </w:p>
     <w:p>
@@ -16890,24 +16839,12 @@
       <w:r>
         <w:rPr>
           <w:rFonts w:ascii="Lexend" w:cs="Lexend" w:eastAsia="Lexend" w:hAnsi="Lexend"/>
-          <w:b/>
-          <w:bCs/>
-          <w:color w:val="1A1A1A"/>
-          <w:sz w:val="22"/>
-          <w:szCs w:val="22"/>
-          <w:lang w:val="es-AR"/>
-        </w:rPr>
-        <w:t xml:space="preserve">R:</w:t>
-      </w:r>
-      <w:r>
-        <w:rPr>
-          <w:rFonts w:ascii="Lexend" w:cs="Lexend" w:eastAsia="Lexend" w:hAnsi="Lexend"/>
-          <w:color w:val="1A1A1A"/>
-          <w:sz w:val="22"/>
-          <w:szCs w:val="22"/>
-          <w:lang w:val="es-AR"/>
-        </w:rPr>
-        <w:t xml:space="preserve"> Un área es una </w:t>
+          <w:color w:val="1A1A1A"/>
+          <w:sz w:val="22"/>
+          <w:szCs w:val="22"/>
+          <w:lang w:val="es-AR"/>
+        </w:rPr>
+        <w:t xml:space="preserve">Un área es una </w:t>
       </w:r>
       <w:r>
         <w:rPr>
@@ -17203,14 +17140,14 @@
       <w:r>
         <w:rPr>
           <w:rFonts w:ascii="Lexend" w:cs="Lexend" w:eastAsia="Lexend" w:hAnsi="Lexend"/>
-          <w:b/>
-          <w:bCs/>
-          <w:color w:val="1A1A1A"/>
-          <w:sz w:val="22"/>
-          <w:szCs w:val="22"/>
-          <w:lang w:val="es-AR"/>
-        </w:rPr>
-        <w:t xml:space="preserve">[Tanenbaum]</w:t>
+          <w:i/>
+          <w:iCs/>
+          <w:color w:val="1A1A1A"/>
+          <w:sz w:val="22"/>
+          <w:szCs w:val="22"/>
+          <w:lang w:val="es-AR"/>
+        </w:rPr>
+        <w:t xml:space="preserve">(Tanenbaum)</w:t>
       </w:r>
     </w:p>
     <w:p>
@@ -17228,25 +17165,7 @@
           <w:szCs w:val="22"/>
           <w:lang w:val="es-AR"/>
         </w:rPr>
-        <w:t xml:space="preserve">P12. ¿En qué consiste el protocolo BGP? ¿En qué entorno se aplica? ¿Qué filosofía de ruteo utiliza?</w:t>
-      </w:r>
-    </w:p>
-    <w:p>
-      <w:pPr>
-        <w:spacing w:after="260" w:line="288"/>
-        <w:jc w:val="center"/>
-      </w:pPr>
-      <w:r>
-        <w:rPr>
-          <w:rFonts w:ascii="Lexend" w:cs="Lexend" w:eastAsia="Lexend" w:hAnsi="Lexend"/>
-          <w:b/>
-          <w:bCs/>
-          <w:color w:val="1A1A1A"/>
-          <w:sz w:val="22"/>
-          <w:szCs w:val="22"/>
-          <w:lang w:val="es-AR"/>
-        </w:rPr>
-        <w:t xml:space="preserve">R:</w:t>
+        <w:t xml:space="preserve">12) ¿En qué consiste el protocolo BGP? ¿En qué entorno se aplica? ¿Qué filosofía de ruteo utiliza?</w:t>
       </w:r>
     </w:p>
     <w:p>
@@ -17704,7 +17623,7 @@
           <w:szCs w:val="22"/>
           <w:lang w:val="es-AR"/>
         </w:rPr>
-        <w:t xml:space="preserve">P13. ¿Cómo están compuestos los paquetes de Estado de Enlace en OSPF?</w:t>
+        <w:t xml:space="preserve">13) ¿Cómo están compuestos los paquetes de Estado de Enlace en OSPF?</w:t>
       </w:r>
     </w:p>
     <w:p>
@@ -17715,24 +17634,12 @@
       <w:r>
         <w:rPr>
           <w:rFonts w:ascii="Lexend" w:cs="Lexend" w:eastAsia="Lexend" w:hAnsi="Lexend"/>
-          <w:b/>
-          <w:bCs/>
-          <w:color w:val="1A1A1A"/>
-          <w:sz w:val="22"/>
-          <w:szCs w:val="22"/>
-          <w:lang w:val="es-AR"/>
-        </w:rPr>
-        <w:t xml:space="preserve">R:</w:t>
-      </w:r>
-      <w:r>
-        <w:rPr>
-          <w:rFonts w:ascii="Lexend" w:cs="Lexend" w:eastAsia="Lexend" w:hAnsi="Lexend"/>
-          <w:color w:val="1A1A1A"/>
-          <w:sz w:val="22"/>
-          <w:szCs w:val="22"/>
-          <w:lang w:val="es-AR"/>
-        </w:rPr>
-        <w:t xml:space="preserve"> Cada paquete de estado de enlace (LSP) contiene:</w:t>
+          <w:color w:val="1A1A1A"/>
+          <w:sz w:val="22"/>
+          <w:szCs w:val="22"/>
+          <w:lang w:val="es-AR"/>
+        </w:rPr>
+        <w:t xml:space="preserve">Cada paquete de estado de enlace (LSP) contiene:</w:t>
       </w:r>
     </w:p>
     <w:p>
@@ -17909,6 +17816,24 @@
     </w:p>
     <w:p>
       <w:pPr>
+        <w:spacing w:after="120" w:line="280"/>
+        <w:jc w:val="both"/>
+      </w:pPr>
+      <w:r>
+        <w:rPr>
+          <w:rFonts w:ascii="Lexend" w:cs="Lexend" w:eastAsia="Lexend" w:hAnsi="Lexend"/>
+          <w:i/>
+          <w:iCs/>
+          <w:color w:val="1A1A1A"/>
+          <w:sz w:val="22"/>
+          <w:szCs w:val="22"/>
+          <w:lang w:val="es-AR"/>
+        </w:rPr>
+        <w:t xml:space="preserve">(Tanenbaum)</w:t>
+      </w:r>
+    </w:p>
+    <w:p>
+      <w:pPr>
         <w:spacing w:after="260" w:line="288"/>
         <w:jc w:val="center"/>
       </w:pPr>
@@ -17922,7 +17847,145 @@
           <w:szCs w:val="22"/>
           <w:lang w:val="es-AR"/>
         </w:rPr>
-        <w:t xml:space="preserve">[Tanenbaum]</w:t>
+        <w:t xml:space="preserve">14) ¿En qué consiste un Grafo en OSPF y con qué fines se realiza?</w:t>
+      </w:r>
+    </w:p>
+    <w:p>
+      <w:pPr>
+        <w:spacing w:after="120" w:line="280"/>
+        <w:jc w:val="both"/>
+      </w:pPr>
+      <w:r>
+        <w:rPr>
+          <w:rFonts w:ascii="Lexend" w:cs="Lexend" w:eastAsia="Lexend" w:hAnsi="Lexend"/>
+          <w:color w:val="1A1A1A"/>
+          <w:sz w:val="22"/>
+          <w:szCs w:val="22"/>
+          <w:lang w:val="es-AR"/>
+        </w:rPr>
+        <w:t xml:space="preserve">Con los paquetes de estado de enlace que recibe de todos los routers, </w:t>
+      </w:r>
+      <w:r>
+        <w:rPr>
+          <w:rFonts w:ascii="Lexend" w:cs="Lexend" w:eastAsia="Lexend" w:hAnsi="Lexend"/>
+          <w:b/>
+          <w:bCs/>
+          <w:color w:val="1A1A1A"/>
+          <w:sz w:val="22"/>
+          <w:szCs w:val="22"/>
+          <w:lang w:val="es-AR"/>
+        </w:rPr>
+        <w:t xml:space="preserve">cada router arma un grafo de la topología completa</w:t>
+      </w:r>
+      <w:r>
+        <w:rPr>
+          <w:rFonts w:ascii="Lexend" w:cs="Lexend" w:eastAsia="Lexend" w:hAnsi="Lexend"/>
+          <w:color w:val="1A1A1A"/>
+          <w:sz w:val="22"/>
+          <w:szCs w:val="22"/>
+          <w:lang w:val="es-AR"/>
+        </w:rPr>
+        <w:t xml:space="preserve">: los </w:t>
+      </w:r>
+      <w:r>
+        <w:rPr>
+          <w:rFonts w:ascii="Lexend" w:cs="Lexend" w:eastAsia="Lexend" w:hAnsi="Lexend"/>
+          <w:b/>
+          <w:bCs/>
+          <w:color w:val="1A1A1A"/>
+          <w:sz w:val="22"/>
+          <w:szCs w:val="22"/>
+          <w:lang w:val="es-AR"/>
+        </w:rPr>
+        <w:t xml:space="preserve">nodos</w:t>
+      </w:r>
+      <w:r>
+        <w:rPr>
+          <w:rFonts w:ascii="Lexend" w:cs="Lexend" w:eastAsia="Lexend" w:hAnsi="Lexend"/>
+          <w:color w:val="1A1A1A"/>
+          <w:sz w:val="22"/>
+          <w:szCs w:val="22"/>
+          <w:lang w:val="es-AR"/>
+        </w:rPr>
+        <w:t xml:space="preserve"> son los routers y las </w:t>
+      </w:r>
+      <w:r>
+        <w:rPr>
+          <w:rFonts w:ascii="Lexend" w:cs="Lexend" w:eastAsia="Lexend" w:hAnsi="Lexend"/>
+          <w:b/>
+          <w:bCs/>
+          <w:color w:val="1A1A1A"/>
+          <w:sz w:val="22"/>
+          <w:szCs w:val="22"/>
+          <w:lang w:val="es-AR"/>
+        </w:rPr>
+        <w:t xml:space="preserve">aristas</w:t>
+      </w:r>
+      <w:r>
+        <w:rPr>
+          <w:rFonts w:ascii="Lexend" w:cs="Lexend" w:eastAsia="Lexend" w:hAnsi="Lexend"/>
+          <w:color w:val="1A1A1A"/>
+          <w:sz w:val="22"/>
+          <w:szCs w:val="22"/>
+          <w:lang w:val="es-AR"/>
+        </w:rPr>
+        <w:t xml:space="preserve"> son los enlaces, con su costo. Ese grafo se arma para </w:t>
+      </w:r>
+      <w:r>
+        <w:rPr>
+          <w:rFonts w:ascii="Lexend" w:cs="Lexend" w:eastAsia="Lexend" w:hAnsi="Lexend"/>
+          <w:b/>
+          <w:bCs/>
+          <w:color w:val="1A1A1A"/>
+          <w:sz w:val="22"/>
+          <w:szCs w:val="22"/>
+          <w:lang w:val="es-AR"/>
+        </w:rPr>
+        <w:t xml:space="preserve">calcular sobre él, con Dijkstra, la ruta más corta a cada destino</w:t>
+      </w:r>
+      <w:r>
+        <w:rPr>
+          <w:rFonts w:ascii="Lexend" w:cs="Lexend" w:eastAsia="Lexend" w:hAnsi="Lexend"/>
+          <w:color w:val="1A1A1A"/>
+          <w:sz w:val="22"/>
+          <w:szCs w:val="22"/>
+          <w:lang w:val="es-AR"/>
+        </w:rPr>
+        <w:t xml:space="preserve"> y así llenar la tabla de ruteo. Cada router lo calcula </w:t>
+      </w:r>
+      <w:r>
+        <w:rPr>
+          <w:rFonts w:ascii="Lexend" w:cs="Lexend" w:eastAsia="Lexend" w:hAnsi="Lexend"/>
+          <w:b/>
+          <w:bCs/>
+          <w:color w:val="1A1A1A"/>
+          <w:sz w:val="22"/>
+          <w:szCs w:val="22"/>
+          <w:lang w:val="es-AR"/>
+        </w:rPr>
+        <w:t xml:space="preserve">localmente</w:t>
+      </w:r>
+      <w:r>
+        <w:rPr>
+          <w:rFonts w:ascii="Lexend" w:cs="Lexend" w:eastAsia="Lexend" w:hAnsi="Lexend"/>
+          <w:color w:val="1A1A1A"/>
+          <w:sz w:val="22"/>
+          <w:szCs w:val="22"/>
+          <w:lang w:val="es-AR"/>
+        </w:rPr>
+        <w:t xml:space="preserve"> y con información completa. </w:t>
+      </w:r>
+      <w:r>
+        <w:rPr>
+          <w:rFonts w:ascii="Lexend" w:cs="Lexend" w:eastAsia="Lexend" w:hAnsi="Lexend"/>
+          <w:i/>
+          <w:iCs/>
+          <w:color w:val="1A1A1A"/>
+          <w:sz w:val="22"/>
+          <w:szCs w:val="22"/>
+          <w:lang w:val="es-AR"/>
+        </w:rPr>
+        <w:t xml:space="preserve">(Tanenbaum)</w:t>
       </w:r>
     </w:p>
     <w:p>
@@ -17940,193 +18003,7 @@
           <w:szCs w:val="22"/>
           <w:lang w:val="es-AR"/>
         </w:rPr>
-        <w:t xml:space="preserve">P14. ¿En qué consiste un Grafo en OSPF y con qué fines se realiza?</w:t>
-      </w:r>
-    </w:p>
-    <w:p>
-      <w:pPr>
-        <w:spacing w:after="120" w:line="280"/>
-        <w:jc w:val="both"/>
-      </w:pPr>
-      <w:r>
-        <w:rPr>
-          <w:rFonts w:ascii="Lexend" w:cs="Lexend" w:eastAsia="Lexend" w:hAnsi="Lexend"/>
-          <w:b/>
-          <w:bCs/>
-          <w:color w:val="1A1A1A"/>
-          <w:sz w:val="22"/>
-          <w:szCs w:val="22"/>
-          <w:lang w:val="es-AR"/>
-        </w:rPr>
-        <w:t xml:space="preserve">R:</w:t>
-      </w:r>
-      <w:r>
-        <w:rPr>
-          <w:rFonts w:ascii="Lexend" w:cs="Lexend" w:eastAsia="Lexend" w:hAnsi="Lexend"/>
-          <w:color w:val="1A1A1A"/>
-          <w:sz w:val="22"/>
-          <w:szCs w:val="22"/>
-          <w:lang w:val="es-AR"/>
-        </w:rPr>
-        <w:t xml:space="preserve"> Con los paquetes de estado de enlace que recibe de todos los routers, </w:t>
-      </w:r>
-      <w:r>
-        <w:rPr>
-          <w:rFonts w:ascii="Lexend" w:cs="Lexend" w:eastAsia="Lexend" w:hAnsi="Lexend"/>
-          <w:b/>
-          <w:bCs/>
-          <w:color w:val="1A1A1A"/>
-          <w:sz w:val="22"/>
-          <w:szCs w:val="22"/>
-          <w:lang w:val="es-AR"/>
-        </w:rPr>
-        <w:t xml:space="preserve">cada router arma un grafo de la topología completa</w:t>
-      </w:r>
-      <w:r>
-        <w:rPr>
-          <w:rFonts w:ascii="Lexend" w:cs="Lexend" w:eastAsia="Lexend" w:hAnsi="Lexend"/>
-          <w:color w:val="1A1A1A"/>
-          <w:sz w:val="22"/>
-          <w:szCs w:val="22"/>
-          <w:lang w:val="es-AR"/>
-        </w:rPr>
-        <w:t xml:space="preserve">: los </w:t>
-      </w:r>
-      <w:r>
-        <w:rPr>
-          <w:rFonts w:ascii="Lexend" w:cs="Lexend" w:eastAsia="Lexend" w:hAnsi="Lexend"/>
-          <w:b/>
-          <w:bCs/>
-          <w:color w:val="1A1A1A"/>
-          <w:sz w:val="22"/>
-          <w:szCs w:val="22"/>
-          <w:lang w:val="es-AR"/>
-        </w:rPr>
-        <w:t xml:space="preserve">nodos</w:t>
-      </w:r>
-      <w:r>
-        <w:rPr>
-          <w:rFonts w:ascii="Lexend" w:cs="Lexend" w:eastAsia="Lexend" w:hAnsi="Lexend"/>
-          <w:color w:val="1A1A1A"/>
-          <w:sz w:val="22"/>
-          <w:szCs w:val="22"/>
-          <w:lang w:val="es-AR"/>
-        </w:rPr>
-        <w:t xml:space="preserve"> son los routers y las </w:t>
-      </w:r>
-      <w:r>
-        <w:rPr>
-          <w:rFonts w:ascii="Lexend" w:cs="Lexend" w:eastAsia="Lexend" w:hAnsi="Lexend"/>
-          <w:b/>
-          <w:bCs/>
-          <w:color w:val="1A1A1A"/>
-          <w:sz w:val="22"/>
-          <w:szCs w:val="22"/>
-          <w:lang w:val="es-AR"/>
-        </w:rPr>
-        <w:t xml:space="preserve">aristas</w:t>
-      </w:r>
-      <w:r>
-        <w:rPr>
-          <w:rFonts w:ascii="Lexend" w:cs="Lexend" w:eastAsia="Lexend" w:hAnsi="Lexend"/>
-          <w:color w:val="1A1A1A"/>
-          <w:sz w:val="22"/>
-          <w:szCs w:val="22"/>
-          <w:lang w:val="es-AR"/>
-        </w:rPr>
-        <w:t xml:space="preserve"> son los enlaces, con su costo. Ese grafo se arma para </w:t>
-      </w:r>
-      <w:r>
-        <w:rPr>
-          <w:rFonts w:ascii="Lexend" w:cs="Lexend" w:eastAsia="Lexend" w:hAnsi="Lexend"/>
-          <w:b/>
-          <w:bCs/>
-          <w:color w:val="1A1A1A"/>
-          <w:sz w:val="22"/>
-          <w:szCs w:val="22"/>
-          <w:lang w:val="es-AR"/>
-        </w:rPr>
-        <w:t xml:space="preserve">calcular sobre él, con Dijkstra, la ruta más corta a cada destino</w:t>
-      </w:r>
-      <w:r>
-        <w:rPr>
-          <w:rFonts w:ascii="Lexend" w:cs="Lexend" w:eastAsia="Lexend" w:hAnsi="Lexend"/>
-          <w:color w:val="1A1A1A"/>
-          <w:sz w:val="22"/>
-          <w:szCs w:val="22"/>
-          <w:lang w:val="es-AR"/>
-        </w:rPr>
-        <w:t xml:space="preserve"> y así llenar la tabla de ruteo. Cada router lo calcula </w:t>
-      </w:r>
-      <w:r>
-        <w:rPr>
-          <w:rFonts w:ascii="Lexend" w:cs="Lexend" w:eastAsia="Lexend" w:hAnsi="Lexend"/>
-          <w:b/>
-          <w:bCs/>
-          <w:color w:val="1A1A1A"/>
-          <w:sz w:val="22"/>
-          <w:szCs w:val="22"/>
-          <w:lang w:val="es-AR"/>
-        </w:rPr>
-        <w:t xml:space="preserve">localmente</w:t>
-      </w:r>
-      <w:r>
-        <w:rPr>
-          <w:rFonts w:ascii="Lexend" w:cs="Lexend" w:eastAsia="Lexend" w:hAnsi="Lexend"/>
-          <w:color w:val="1A1A1A"/>
-          <w:sz w:val="22"/>
-          <w:szCs w:val="22"/>
-          <w:lang w:val="es-AR"/>
-        </w:rPr>
-        <w:t xml:space="preserve"> y con información completa. </w:t>
-      </w:r>
-      <w:r>
-        <w:rPr>
-          <w:rFonts w:ascii="Lexend" w:cs="Lexend" w:eastAsia="Lexend" w:hAnsi="Lexend"/>
-          <w:b/>
-          <w:bCs/>
-          <w:color w:val="1A1A1A"/>
-          <w:sz w:val="22"/>
-          <w:szCs w:val="22"/>
-          <w:lang w:val="es-AR"/>
-        </w:rPr>
-        <w:t xml:space="preserve">[Tanenbaum]</w:t>
-      </w:r>
-    </w:p>
-    <w:p>
-      <w:pPr>
-        <w:spacing w:after="260" w:line="288"/>
-        <w:jc w:val="center"/>
-      </w:pPr>
-      <w:r>
-        <w:rPr>
-          <w:rFonts w:ascii="Lexend" w:cs="Lexend" w:eastAsia="Lexend" w:hAnsi="Lexend"/>
-          <w:b/>
-          <w:bCs/>
-          <w:color w:val="1A1A1A"/>
-          <w:sz w:val="22"/>
-          <w:szCs w:val="22"/>
-          <w:lang w:val="es-AR"/>
-        </w:rPr>
-        <w:t xml:space="preserve">P15. ¿Cuáles son los 5 pasos que ejecuta el OSPF para aprender y difundir rutas óptimas?</w:t>
-      </w:r>
-    </w:p>
-    <w:p>
-      <w:pPr>
-        <w:spacing w:after="260" w:line="288"/>
-        <w:jc w:val="center"/>
-      </w:pPr>
-      <w:r>
-        <w:rPr>
-          <w:rFonts w:ascii="Lexend" w:cs="Lexend" w:eastAsia="Lexend" w:hAnsi="Lexend"/>
-          <w:b/>
-          <w:bCs/>
-          <w:color w:val="1A1A1A"/>
-          <w:sz w:val="22"/>
-          <w:szCs w:val="22"/>
-          <w:lang w:val="es-AR"/>
-        </w:rPr>
-        <w:t xml:space="preserve">R:</w:t>
+        <w:t xml:space="preserve">15) ¿Cuáles son los 5 pasos que ejecuta el OSPF para aprender y difundir rutas óptimas?</w:t>
       </w:r>
     </w:p>
     <w:p>
@@ -18334,44 +18211,23 @@
           <w:szCs w:val="25"/>
           <w:lang w:val="es-AR"/>
         </w:rPr>
-        <w:t xml:space="preserve">8. EJERCICIOS PARA PRACTICAR (CON RESPUESTAS)</w:t>
-      </w:r>
-    </w:p>
-    <w:p>
-      <w:pPr>
-        <w:spacing w:after="260" w:before="180" w:line="264"/>
-        <w:ind w:left="454" w:right="454"/>
+        <w:t xml:space="preserve">EJERCICIOS DE PRÁCTICA</w:t>
+      </w:r>
+    </w:p>
+    <w:p>
+      <w:pPr>
+        <w:spacing w:after="120" w:line="280"/>
         <w:jc w:val="both"/>
       </w:pPr>
       <w:r>
         <w:rPr>
           <w:rFonts w:ascii="Lexend" w:cs="Lexend" w:eastAsia="Lexend" w:hAnsi="Lexend"/>
           <w:color w:val="1A1A1A"/>
-          <w:sz w:val="20"/>
-          <w:szCs w:val="20"/>
-          <w:lang w:val="es-AR"/>
-        </w:rPr>
-        <w:t xml:space="preserve">Intentalos antes de mirar la respuesta. Están verificados con Python (módulo </w:t>
-      </w:r>
-      <w:r>
-        <w:rPr>
-          <w:rFonts w:ascii="Consolas" w:cs="Consolas" w:eastAsia="Consolas" w:hAnsi="Consolas"/>
-          <w:color w:val="1A1A1A"/>
-          <w:sz w:val="18"/>
-          <w:szCs w:val="18"/>
-          <w:lang w:val="es-AR"/>
-        </w:rPr>
-        <w:t xml:space="preserve">ipaddress</w:t>
-      </w:r>
-      <w:r>
-        <w:rPr>
-          <w:rFonts w:ascii="Lexend" w:cs="Lexend" w:eastAsia="Lexend" w:hAnsi="Lexend"/>
-          <w:color w:val="1A1A1A"/>
-          <w:sz w:val="20"/>
-          <w:szCs w:val="20"/>
-          <w:lang w:val="es-AR"/>
-        </w:rPr>
-        <w:t xml:space="preserve">).</w:t>
+          <w:sz w:val="22"/>
+          <w:szCs w:val="22"/>
+          <w:lang w:val="es-AR"/>
+        </w:rPr>
+        <w:t xml:space="preserve">Intentalos antes de mirar las respuestas, que están al final de la sección.</w:t>
       </w:r>
     </w:p>
     <w:p>
@@ -19527,7 +19383,7 @@
           <w:szCs w:val="25"/>
           <w:lang w:val="es-AR"/>
         </w:rPr>
-        <w:t xml:space="preserve">DATOS DE MEMORIA</w:t>
+        <w:t xml:space="preserve">DATOS PARA MEMORIZAR</w:t>
       </w:r>
     </w:p>
     <w:p>
@@ -20223,6 +20079,242 @@
           <w:lang w:val="es-AR"/>
         </w:rPr>
         <w:t xml:space="preserve">.</w:t>
+      </w:r>
+    </w:p>
+    <w:p>
+      <w:pPr>
+        <w:pStyle w:val="Heading1"/>
+        <w:keepNext/>
+        <w:spacing w:after="220" w:before="380"/>
+        <w:jc w:val="center"/>
+      </w:pPr>
+      <w:r>
+        <w:rPr>
+          <w:rFonts w:ascii="Lexend" w:cs="Lexend" w:eastAsia="Lexend" w:hAnsi="Lexend"/>
+          <w:b/>
+          <w:bCs/>
+          <w:color w:val="1A1A1A"/>
+          <w:spacing w:val="30"/>
+          <w:sz w:val="25"/>
+          <w:szCs w:val="25"/>
+          <w:lang w:val="es-AR"/>
+        </w:rPr>
+        <w:t xml:space="preserve">FUENTES</w:t>
+      </w:r>
+    </w:p>
+    <w:p>
+      <w:pPr>
+        <w:pStyle w:val="ListParagraph"/>
+        <w:numPr>
+          <w:ilvl w:val="0"/>
+          <w:numId w:val="1"/>
+        </w:numPr>
+        <w:spacing w:after="100" w:line="276"/>
+        <w:jc w:val="both"/>
+      </w:pPr>
+      <w:r>
+        <w:rPr>
+          <w:rFonts w:ascii="Lexend" w:cs="Lexend" w:eastAsia="Lexend" w:hAnsi="Lexend"/>
+          <w:color w:val="1A1A1A"/>
+          <w:sz w:val="22"/>
+          <w:szCs w:val="22"/>
+          <w:lang w:val="es-AR"/>
+        </w:rPr>
+        <w:t xml:space="preserve">Apunte de Baró, </w:t>
+      </w:r>
+      <w:r>
+        <w:rPr>
+          <w:rFonts w:ascii="Lexend" w:cs="Lexend" w:eastAsia="Lexend" w:hAnsi="Lexend"/>
+          <w:i/>
+          <w:iCs/>
+          <w:color w:val="1A1A1A"/>
+          <w:sz w:val="22"/>
+          <w:szCs w:val="22"/>
+          <w:lang w:val="es-AR"/>
+        </w:rPr>
+        <w:t xml:space="preserve">Apunte 2do parcial (Capa de Red)</w:t>
+      </w:r>
+      <w:r>
+        <w:rPr>
+          <w:rFonts w:ascii="Lexend" w:cs="Lexend" w:eastAsia="Lexend" w:hAnsi="Lexend"/>
+          <w:color w:val="1A1A1A"/>
+          <w:sz w:val="22"/>
+          <w:szCs w:val="22"/>
+          <w:lang w:val="es-AR"/>
+        </w:rPr>
+        <w:t xml:space="preserve">: direcciones IP, máscaras, datagrama IP, fragmentación, ARP, ICMP, ping y tracert.</w:t>
+      </w:r>
+    </w:p>
+    <w:p>
+      <w:pPr>
+        <w:pStyle w:val="ListParagraph"/>
+        <w:numPr>
+          <w:ilvl w:val="0"/>
+          <w:numId w:val="1"/>
+        </w:numPr>
+        <w:spacing w:after="100" w:line="276"/>
+        <w:jc w:val="both"/>
+      </w:pPr>
+      <w:r>
+        <w:rPr>
+          <w:rFonts w:ascii="Lexend" w:cs="Lexend" w:eastAsia="Lexend" w:hAnsi="Lexend"/>
+          <w:color w:val="1A1A1A"/>
+          <w:sz w:val="22"/>
+          <w:szCs w:val="22"/>
+          <w:lang w:val="es-AR"/>
+        </w:rPr>
+        <w:t xml:space="preserve">Práctica de Baró, </w:t>
+      </w:r>
+      <w:r>
+        <w:rPr>
+          <w:rFonts w:ascii="Lexend" w:cs="Lexend" w:eastAsia="Lexend" w:hAnsi="Lexend"/>
+          <w:i/>
+          <w:iCs/>
+          <w:color w:val="1A1A1A"/>
+          <w:sz w:val="22"/>
+          <w:szCs w:val="22"/>
+          <w:lang w:val="es-AR"/>
+        </w:rPr>
+        <w:t xml:space="preserve">Direcciones IP - Máscaras de Subred</w:t>
+      </w:r>
+      <w:r>
+        <w:rPr>
+          <w:rFonts w:ascii="Lexend" w:cs="Lexend" w:eastAsia="Lexend" w:hAnsi="Lexend"/>
+          <w:color w:val="1A1A1A"/>
+          <w:sz w:val="22"/>
+          <w:szCs w:val="22"/>
+          <w:lang w:val="es-AR"/>
+        </w:rPr>
+        <w:t xml:space="preserve">.</w:t>
+      </w:r>
+    </w:p>
+    <w:p>
+      <w:pPr>
+        <w:pStyle w:val="ListParagraph"/>
+        <w:numPr>
+          <w:ilvl w:val="0"/>
+          <w:numId w:val="1"/>
+        </w:numPr>
+        <w:spacing w:after="100" w:line="276"/>
+        <w:jc w:val="both"/>
+      </w:pPr>
+      <w:r>
+        <w:rPr>
+          <w:rFonts w:ascii="Lexend" w:cs="Lexend" w:eastAsia="Lexend" w:hAnsi="Lexend"/>
+          <w:color w:val="1A1A1A"/>
+          <w:sz w:val="22"/>
+          <w:szCs w:val="22"/>
+          <w:lang w:val="es-AR"/>
+        </w:rPr>
+        <w:t xml:space="preserve">Guía de estudio de Baró, </w:t>
+      </w:r>
+      <w:r>
+        <w:rPr>
+          <w:rFonts w:ascii="Lexend" w:cs="Lexend" w:eastAsia="Lexend" w:hAnsi="Lexend"/>
+          <w:i/>
+          <w:iCs/>
+          <w:color w:val="1A1A1A"/>
+          <w:sz w:val="22"/>
+          <w:szCs w:val="22"/>
+          <w:lang w:val="es-AR"/>
+        </w:rPr>
+        <w:t xml:space="preserve">Guía de estudio de Capa de Red</w:t>
+      </w:r>
+      <w:r>
+        <w:rPr>
+          <w:rFonts w:ascii="Lexend" w:cs="Lexend" w:eastAsia="Lexend" w:hAnsi="Lexend"/>
+          <w:color w:val="1A1A1A"/>
+          <w:sz w:val="22"/>
+          <w:szCs w:val="22"/>
+          <w:lang w:val="es-AR"/>
+        </w:rPr>
+        <w:t xml:space="preserve">.</w:t>
+      </w:r>
+    </w:p>
+    <w:p>
+      <w:pPr>
+        <w:pStyle w:val="ListParagraph"/>
+        <w:numPr>
+          <w:ilvl w:val="0"/>
+          <w:numId w:val="1"/>
+        </w:numPr>
+        <w:spacing w:after="100" w:line="276"/>
+        <w:jc w:val="both"/>
+      </w:pPr>
+      <w:r>
+        <w:rPr>
+          <w:rFonts w:ascii="Lexend" w:cs="Lexend" w:eastAsia="Lexend" w:hAnsi="Lexend"/>
+          <w:color w:val="1A1A1A"/>
+          <w:sz w:val="22"/>
+          <w:szCs w:val="22"/>
+          <w:lang w:val="es-AR"/>
+        </w:rPr>
+        <w:t xml:space="preserve">Tanenbaum y Wetherall, </w:t>
+      </w:r>
+      <w:r>
+        <w:rPr>
+          <w:rFonts w:ascii="Lexend" w:cs="Lexend" w:eastAsia="Lexend" w:hAnsi="Lexend"/>
+          <w:i/>
+          <w:iCs/>
+          <w:color w:val="1A1A1A"/>
+          <w:sz w:val="22"/>
+          <w:szCs w:val="22"/>
+          <w:lang w:val="es-AR"/>
+        </w:rPr>
+        <w:t xml:space="preserve">Redes de Computadoras</w:t>
+      </w:r>
+      <w:r>
+        <w:rPr>
+          <w:rFonts w:ascii="Lexend" w:cs="Lexend" w:eastAsia="Lexend" w:hAnsi="Lexend"/>
+          <w:color w:val="1A1A1A"/>
+          <w:sz w:val="22"/>
+          <w:szCs w:val="22"/>
+          <w:lang w:val="es-AR"/>
+        </w:rPr>
+        <w:t xml:space="preserve">, 5ª ed., cap. 5 (5.1, 5.2.1–5.2.5, 5.6.1–5.6.2, 5.6.4, 5.6.6–5.6.7).</w:t>
+      </w:r>
+    </w:p>
+    <w:p>
+      <w:pPr>
+        <w:pStyle w:val="ListParagraph"/>
+        <w:numPr>
+          <w:ilvl w:val="0"/>
+          <w:numId w:val="1"/>
+        </w:numPr>
+        <w:spacing w:after="100" w:line="276"/>
+        <w:jc w:val="both"/>
+      </w:pPr>
+      <w:r>
+        <w:rPr>
+          <w:rFonts w:ascii="Lexend" w:cs="Lexend" w:eastAsia="Lexend" w:hAnsi="Lexend"/>
+          <w:color w:val="1A1A1A"/>
+          <w:sz w:val="22"/>
+          <w:szCs w:val="22"/>
+          <w:lang w:val="es-AR"/>
+        </w:rPr>
+        <w:t xml:space="preserve">Los temas marcados </w:t>
+      </w:r>
+      <w:r>
+        <w:rPr>
+          <w:rFonts w:ascii="Lexend" w:cs="Lexend" w:eastAsia="Lexend" w:hAnsi="Lexend"/>
+          <w:i/>
+          <w:iCs/>
+          <w:color w:val="1A1A1A"/>
+          <w:sz w:val="22"/>
+          <w:szCs w:val="22"/>
+          <w:lang w:val="es-AR"/>
+        </w:rPr>
+        <w:t xml:space="preserve">(Tanenbaum)</w:t>
+      </w:r>
+      <w:r>
+        <w:rPr>
+          <w:rFonts w:ascii="Lexend" w:cs="Lexend" w:eastAsia="Lexend" w:hAnsi="Lexend"/>
+          <w:color w:val="1A1A1A"/>
+          <w:sz w:val="22"/>
+          <w:szCs w:val="22"/>
+          <w:lang w:val="es-AR"/>
+        </w:rPr>
+        <w:t xml:space="preserve"> no están desarrollados en el apunte de Baró: se completaron con el libro.</w:t>
       </w:r>
     </w:p>
     <w:sectPr>

</xml_diff>

<commit_message>
RD: registro de ruta y marca de tiempo — son opciones de ip que se usan vía icmp; tipos 13/14 aparte (wiki, resumen y cuestionario de baró)
Co-Authored-By: Claude Opus 5.5 (1M context) <noreply@anthropic.com>
</commit_message>
<xml_diff>
--- a/materias/RD/estudio/resumen-2do-parcial-baro.docx
+++ b/materias/RD/estudio/resumen-2do-parcial-baro.docx
@@ -9865,7 +9865,7 @@
           <w:szCs w:val="22"/>
           <w:lang w:val="es-AR"/>
         </w:rPr>
-        <w:t xml:space="preserve">También es el protocolo de control que se usa con las opciones </w:t>
+        <w:t xml:space="preserve">También es el protocolo de control que se usa con las opciones de diagnóstico del header IP </w:t>
       </w:r>
       <w:r>
         <w:rPr>
@@ -9929,7 +9929,27 @@
           <w:szCs w:val="22"/>
           <w:lang w:val="es-AR"/>
         </w:rPr>
-        <w:t xml:space="preserve">, tipos 13/14).</w:t>
+        <w:t xml:space="preserve">, </w:t>
+      </w:r>
+      <w:r>
+        <w:rPr>
+          <w:rFonts w:ascii="Consolas" w:cs="Consolas" w:eastAsia="Consolas" w:hAnsi="Consolas"/>
+          <w:color w:val="1A1A1A"/>
+          <w:sz w:val="20"/>
+          <w:szCs w:val="20"/>
+          <w:lang w:val="es-AR"/>
+        </w:rPr>
+        <w:t xml:space="preserve">ping -s</w:t>
+      </w:r>
+      <w:r>
+        <w:rPr>
+          <w:rFonts w:ascii="Lexend" w:cs="Lexend" w:eastAsia="Lexend" w:hAnsi="Lexend"/>
+          <w:color w:val="1A1A1A"/>
+          <w:sz w:val="22"/>
+          <w:szCs w:val="22"/>
+          <w:lang w:val="es-AR"/>
+        </w:rPr>
+        <w:t xml:space="preserve">). No confundir con los tipos ICMP 13/14, que son otro mecanismo.</w:t>
       </w:r>
     </w:p>
     <w:p>
@@ -15037,29 +15057,95 @@
           <w:szCs w:val="22"/>
           <w:lang w:val="es-AR"/>
         </w:rPr>
-        <w:t xml:space="preserve">. Las dos opciones se usan con los mensajes de </w:t>
-      </w:r>
-      <w:r>
-        <w:rPr>
-          <w:rFonts w:ascii="Lexend" w:cs="Lexend" w:eastAsia="Lexend" w:hAnsi="Lexend"/>
-          <w:b/>
-          <w:bCs/>
-          <w:color w:val="1A1A1A"/>
-          <w:sz w:val="22"/>
-          <w:szCs w:val="22"/>
-          <w:lang w:val="es-AR"/>
-        </w:rPr>
-        <w:t xml:space="preserve">eco</w:t>
-      </w:r>
-      <w:r>
-        <w:rPr>
-          <w:rFonts w:ascii="Lexend" w:cs="Lexend" w:eastAsia="Lexend" w:hAnsi="Lexend"/>
-          <w:color w:val="1A1A1A"/>
-          <w:sz w:val="22"/>
-          <w:szCs w:val="22"/>
-          <w:lang w:val="es-AR"/>
-        </w:rPr>
-        <w:t xml:space="preserve"> de ICMP (</w:t>
+        <w:t xml:space="preserve">. Registro de ruta y marca de tiempo son </w:t>
+      </w:r>
+      <w:r>
+        <w:rPr>
+          <w:rFonts w:ascii="Lexend" w:cs="Lexend" w:eastAsia="Lexend" w:hAnsi="Lexend"/>
+          <w:b/>
+          <w:bCs/>
+          <w:color w:val="1A1A1A"/>
+          <w:sz w:val="22"/>
+          <w:szCs w:val="22"/>
+          <w:lang w:val="es-AR"/>
+        </w:rPr>
+        <w:t xml:space="preserve">opciones del header IP</w:t>
+      </w:r>
+      <w:r>
+        <w:rPr>
+          <w:rFonts w:ascii="Lexend" w:cs="Lexend" w:eastAsia="Lexend" w:hAnsi="Lexend"/>
+          <w:color w:val="1A1A1A"/>
+          <w:sz w:val="22"/>
+          <w:szCs w:val="22"/>
+          <w:lang w:val="es-AR"/>
+        </w:rPr>
+        <w:t xml:space="preserve"> pensadas para diagnóstico: la primera muestra el </w:t>
+      </w:r>
+      <w:r>
+        <w:rPr>
+          <w:rFonts w:ascii="Lexend" w:cs="Lexend" w:eastAsia="Lexend" w:hAnsi="Lexend"/>
+          <w:b/>
+          <w:bCs/>
+          <w:color w:val="1A1A1A"/>
+          <w:sz w:val="22"/>
+          <w:szCs w:val="22"/>
+          <w:lang w:val="es-AR"/>
+        </w:rPr>
+        <w:t xml:space="preserve">camino</w:t>
+      </w:r>
+      <w:r>
+        <w:rPr>
+          <w:rFonts w:ascii="Lexend" w:cs="Lexend" w:eastAsia="Lexend" w:hAnsi="Lexend"/>
+          <w:color w:val="1A1A1A"/>
+          <w:sz w:val="22"/>
+          <w:szCs w:val="22"/>
+          <w:lang w:val="es-AR"/>
+        </w:rPr>
+        <w:t xml:space="preserve"> que siguió el paquete y la segunda la </w:t>
+      </w:r>
+      <w:r>
+        <w:rPr>
+          <w:rFonts w:ascii="Lexend" w:cs="Lexend" w:eastAsia="Lexend" w:hAnsi="Lexend"/>
+          <w:b/>
+          <w:bCs/>
+          <w:color w:val="1A1A1A"/>
+          <w:sz w:val="22"/>
+          <w:szCs w:val="22"/>
+          <w:lang w:val="es-AR"/>
+        </w:rPr>
+        <w:t xml:space="preserve">demora</w:t>
+      </w:r>
+      <w:r>
+        <w:rPr>
+          <w:rFonts w:ascii="Lexend" w:cs="Lexend" w:eastAsia="Lexend" w:hAnsi="Lexend"/>
+          <w:color w:val="1A1A1A"/>
+          <w:sz w:val="22"/>
+          <w:szCs w:val="22"/>
+          <w:lang w:val="es-AR"/>
+        </w:rPr>
+        <w:t xml:space="preserve"> en cada router. Se usan a través de </w:t>
+      </w:r>
+      <w:r>
+        <w:rPr>
+          <w:rFonts w:ascii="Lexend" w:cs="Lexend" w:eastAsia="Lexend" w:hAnsi="Lexend"/>
+          <w:b/>
+          <w:bCs/>
+          <w:color w:val="1A1A1A"/>
+          <w:sz w:val="22"/>
+          <w:szCs w:val="22"/>
+          <w:lang w:val="es-AR"/>
+        </w:rPr>
+        <w:t xml:space="preserve">ICMP</w:t>
+      </w:r>
+      <w:r>
+        <w:rPr>
+          <w:rFonts w:ascii="Lexend" w:cs="Lexend" w:eastAsia="Lexend" w:hAnsi="Lexend"/>
+          <w:color w:val="1A1A1A"/>
+          <w:sz w:val="22"/>
+          <w:szCs w:val="22"/>
+          <w:lang w:val="es-AR"/>
+        </w:rPr>
+        <w:t xml:space="preserve">, el protocolo de control y diagnóstico de IP, por ejemplo con </w:t>
       </w:r>
       <w:r>
         <w:rPr>
@@ -15079,13 +15165,115 @@
           <w:szCs w:val="22"/>
           <w:lang w:val="es-AR"/>
         </w:rPr>
-        <w:t xml:space="preserve"> hace un ping con registro de ruta), y ICMP tiene además los mensajes específicos de </w:t>
-      </w:r>
-      <w:r>
-        <w:rPr>
-          <w:rFonts w:ascii="Lexend" w:cs="Lexend" w:eastAsia="Lexend" w:hAnsi="Lexend"/>
-          <w:b/>
-          <w:bCs/>
+        <w:t xml:space="preserve"> y </w:t>
+      </w:r>
+      <w:r>
+        <w:rPr>
+          <w:rFonts w:ascii="Consolas" w:cs="Consolas" w:eastAsia="Consolas" w:hAnsi="Consolas"/>
+          <w:color w:val="1A1A1A"/>
+          <w:sz w:val="20"/>
+          <w:szCs w:val="20"/>
+          <w:lang w:val="es-AR"/>
+        </w:rPr>
+        <w:t xml:space="preserve">ping -s</w:t>
+      </w:r>
+      <w:r>
+        <w:rPr>
+          <w:rFonts w:ascii="Lexend" w:cs="Lexend" w:eastAsia="Lexend" w:hAnsi="Lexend"/>
+          <w:color w:val="1A1A1A"/>
+          <w:sz w:val="22"/>
+          <w:szCs w:val="22"/>
+          <w:lang w:val="es-AR"/>
+        </w:rPr>
+        <w:t xml:space="preserve">: el </w:t>
+      </w:r>
+      <w:r>
+        <w:rPr>
+          <w:rFonts w:ascii="Lexend" w:cs="Lexend" w:eastAsia="Lexend" w:hAnsi="Lexend"/>
+          <w:i/>
+          <w:iCs/>
+          <w:color w:val="1A1A1A"/>
+          <w:sz w:val="22"/>
+          <w:szCs w:val="22"/>
+          <w:lang w:val="es-AR"/>
+        </w:rPr>
+        <w:t xml:space="preserve">echo reply</w:t>
+      </w:r>
+      <w:r>
+        <w:rPr>
+          <w:rFonts w:ascii="Lexend" w:cs="Lexend" w:eastAsia="Lexend" w:hAnsi="Lexend"/>
+          <w:color w:val="1A1A1A"/>
+          <w:sz w:val="22"/>
+          <w:szCs w:val="22"/>
+          <w:lang w:val="es-AR"/>
+        </w:rPr>
+        <w:t xml:space="preserve"> trae los datos de vuelta al origen.</w:t>
+      </w:r>
+    </w:p>
+    <w:p>
+      <w:pPr>
+        <w:spacing w:after="120" w:line="280"/>
+        <w:jc w:val="both"/>
+      </w:pPr>
+      <w:r>
+        <w:rPr>
+          <w:rFonts w:ascii="Lexend" w:cs="Lexend" w:eastAsia="Lexend" w:hAnsi="Lexend"/>
+          <w:color w:val="1A1A1A"/>
+          <w:sz w:val="22"/>
+          <w:szCs w:val="22"/>
+          <w:lang w:val="es-AR"/>
+        </w:rPr>
+        <w:t xml:space="preserve">Ojo: los tipos ICMP </w:t>
+      </w:r>
+      <w:r>
+        <w:rPr>
+          <w:rFonts w:ascii="Lexend" w:cs="Lexend" w:eastAsia="Lexend" w:hAnsi="Lexend"/>
+          <w:b/>
+          <w:bCs/>
+          <w:color w:val="1A1A1A"/>
+          <w:sz w:val="22"/>
+          <w:szCs w:val="22"/>
+          <w:lang w:val="es-AR"/>
+        </w:rPr>
+        <w:t xml:space="preserve">13/14</w:t>
+      </w:r>
+      <w:r>
+        <w:rPr>
+          <w:rFonts w:ascii="Lexend" w:cs="Lexend" w:eastAsia="Lexend" w:hAnsi="Lexend"/>
+          <w:color w:val="1A1A1A"/>
+          <w:sz w:val="22"/>
+          <w:szCs w:val="22"/>
+          <w:lang w:val="es-AR"/>
+        </w:rPr>
+        <w:t xml:space="preserve"> (</w:t>
+      </w:r>
+      <w:r>
+        <w:rPr>
+          <w:rFonts w:ascii="Lexend" w:cs="Lexend" w:eastAsia="Lexend" w:hAnsi="Lexend"/>
+          <w:i/>
+          <w:iCs/>
+          <w:color w:val="1A1A1A"/>
+          <w:sz w:val="22"/>
+          <w:szCs w:val="22"/>
+          <w:lang w:val="es-AR"/>
+        </w:rPr>
+        <w:t xml:space="preserve">timestamp</w:t>
+      </w:r>
+      <w:r>
+        <w:rPr>
+          <w:rFonts w:ascii="Lexend" w:cs="Lexend" w:eastAsia="Lexend" w:hAnsi="Lexend"/>
+          <w:color w:val="1A1A1A"/>
+          <w:sz w:val="22"/>
+          <w:szCs w:val="22"/>
+          <w:lang w:val="es-AR"/>
+        </w:rPr>
+        <w:t xml:space="preserve">) son mensajes ICMP aparte, sin relación con la opción </w:t>
+      </w:r>
+      <w:r>
+        <w:rPr>
+          <w:rFonts w:ascii="Lexend" w:cs="Lexend" w:eastAsia="Lexend" w:hAnsi="Lexend"/>
+          <w:i/>
+          <w:iCs/>
           <w:color w:val="1A1A1A"/>
           <w:sz w:val="22"/>
           <w:szCs w:val="22"/>
@@ -15101,51 +15289,7 @@
           <w:szCs w:val="22"/>
           <w:lang w:val="es-AR"/>
         </w:rPr>
-        <w:t xml:space="preserve"> (tipos </w:t>
-      </w:r>
-      <w:r>
-        <w:rPr>
-          <w:rFonts w:ascii="Lexend" w:cs="Lexend" w:eastAsia="Lexend" w:hAnsi="Lexend"/>
-          <w:b/>
-          <w:bCs/>
-          <w:color w:val="1A1A1A"/>
-          <w:sz w:val="22"/>
-          <w:szCs w:val="22"/>
-          <w:lang w:val="es-AR"/>
-        </w:rPr>
-        <w:t xml:space="preserve">13</w:t>
-      </w:r>
-      <w:r>
-        <w:rPr>
-          <w:rFonts w:ascii="Lexend" w:cs="Lexend" w:eastAsia="Lexend" w:hAnsi="Lexend"/>
-          <w:color w:val="1A1A1A"/>
-          <w:sz w:val="22"/>
-          <w:szCs w:val="22"/>
-          <w:lang w:val="es-AR"/>
-        </w:rPr>
-        <w:t xml:space="preserve">, solicitud, y </w:t>
-      </w:r>
-      <w:r>
-        <w:rPr>
-          <w:rFonts w:ascii="Lexend" w:cs="Lexend" w:eastAsia="Lexend" w:hAnsi="Lexend"/>
-          <w:b/>
-          <w:bCs/>
-          <w:color w:val="1A1A1A"/>
-          <w:sz w:val="22"/>
-          <w:szCs w:val="22"/>
-          <w:lang w:val="es-AR"/>
-        </w:rPr>
-        <w:t xml:space="preserve">14</w:t>
-      </w:r>
-      <w:r>
-        <w:rPr>
-          <w:rFonts w:ascii="Lexend" w:cs="Lexend" w:eastAsia="Lexend" w:hAnsi="Lexend"/>
-          <w:color w:val="1A1A1A"/>
-          <w:sz w:val="22"/>
-          <w:szCs w:val="22"/>
-          <w:lang w:val="es-AR"/>
-        </w:rPr>
-        <w:t xml:space="preserve">, respuesta).</w:t>
+        <w:t xml:space="preserve"> de IP. No usarlos como justificación.</w:t>
       </w:r>
     </w:p>
     <w:p>

</xml_diff>